<commit_message>
refactor: remove SelfTest, restore homing boot, reduce MAX_SPEED to 1200
- Remove SelfTest class (self_test.hpp/cpp, test_self_test.cpp) — self-test
  was already disabled; clean up dead code
- Restore normal boot logic in MonitorTask: first boot and homing-only boot
  now send HOMING command instead of skipping to READY
- Remove g_bUartSelfTestReq global; comm_task keeps SELF_TEST ACK response
- Reduce motor MAX_SPEED from 3200 to 1200 for positioning accuracy
- Phase 7 updates: backlash compensation, encoder stall homing, constants cleanup

Co-Authored-By: Claude Opus 4.6 (1M context) <noreply@anthropic.com>
</commit_message>
<xml_diff>
--- a/docs/ref/电动镜头通信协议v2.5.docx
+++ b/docs/ref/电动镜头通信协议v2.5.docx
@@ -6476,6 +6476,12 @@
             <w:insideH w:val="single" w:color="auto" w:sz="4" w:space="0"/>
             <w:insideV w:val="single" w:color="auto" w:sz="4" w:space="0"/>
           </w:tblBorders>
+          <w:tblCellMar>
+            <w:top w:w="0" w:type="dxa"/>
+            <w:left w:w="108" w:type="dxa"/>
+            <w:bottom w:w="0" w:type="dxa"/>
+            <w:right w:w="108" w:type="dxa"/>
+          </w:tblCellMar>
         </w:tblPrEx>
         <w:tc>
           <w:tcPr>
@@ -7649,6 +7655,12 @@
             <w:insideH w:val="single" w:color="auto" w:sz="4" w:space="0"/>
             <w:insideV w:val="single" w:color="auto" w:sz="4" w:space="0"/>
           </w:tblBorders>
+          <w:tblCellMar>
+            <w:top w:w="0" w:type="dxa"/>
+            <w:left w:w="108" w:type="dxa"/>
+            <w:bottom w:w="0" w:type="dxa"/>
+            <w:right w:w="108" w:type="dxa"/>
+          </w:tblCellMar>
         </w:tblPrEx>
         <w:tc>
           <w:tcPr>
@@ -9025,6 +9037,12 @@
             <w:insideH w:val="single" w:color="auto" w:sz="4" w:space="0"/>
             <w:insideV w:val="single" w:color="auto" w:sz="4" w:space="0"/>
           </w:tblBorders>
+          <w:tblCellMar>
+            <w:top w:w="0" w:type="dxa"/>
+            <w:left w:w="108" w:type="dxa"/>
+            <w:bottom w:w="0" w:type="dxa"/>
+            <w:right w:w="108" w:type="dxa"/>
+          </w:tblCellMar>
         </w:tblPrEx>
         <w:tc>
           <w:tcPr>
@@ -9158,6 +9176,301 @@
                 <w:szCs w:val="21"/>
               </w:rPr>
               <w:t>功能描述</w:t>
+            </w:r>
+          </w:p>
+        </w:tc>
+      </w:tr>
+      <w:tr>
+        <w:tblPrEx>
+          <w:tblBorders>
+            <w:top w:val="single" w:color="auto" w:sz="4" w:space="0"/>
+            <w:left w:val="single" w:color="auto" w:sz="4" w:space="0"/>
+            <w:bottom w:val="single" w:color="auto" w:sz="4" w:space="0"/>
+            <w:right w:val="single" w:color="auto" w:sz="4" w:space="0"/>
+            <w:insideH w:val="single" w:color="auto" w:sz="4" w:space="0"/>
+            <w:insideV w:val="single" w:color="auto" w:sz="4" w:space="0"/>
+          </w:tblBorders>
+          <w:tblCellMar>
+            <w:top w:w="0" w:type="dxa"/>
+            <w:left w:w="108" w:type="dxa"/>
+            <w:bottom w:w="0" w:type="dxa"/>
+            <w:right w:w="108" w:type="dxa"/>
+          </w:tblCellMar>
+        </w:tblPrEx>
+        <w:tc>
+          <w:tcPr>
+            <w:tcW w:w="993" w:type="dxa"/>
+            <w:vMerge w:val="restart"/>
+            <w:vAlign w:val="center"/>
+          </w:tcPr>
+          <w:p>
+            <w:pPr>
+              <w:jc w:val="center"/>
+              <w:rPr>
+                <w:rFonts w:hint="eastAsia"/>
+                <w:kern w:val="0"/>
+                <w:sz w:val="21"/>
+                <w:szCs w:val="21"/>
+              </w:rPr>
+            </w:pPr>
+            <w:r>
+              <w:rPr>
+                <w:rFonts w:hint="eastAsia" w:ascii="微软雅黑" w:hAnsi="微软雅黑" w:eastAsia="微软雅黑" w:cs="微软雅黑"/>
+                <w:kern w:val="0"/>
+                <w:sz w:val="21"/>
+                <w:szCs w:val="21"/>
+              </w:rPr>
+              <w:t>0xA5</w:t>
+            </w:r>
+          </w:p>
+        </w:tc>
+        <w:tc>
+          <w:tcPr>
+            <w:tcW w:w="708" w:type="dxa"/>
+          </w:tcPr>
+          <w:p>
+            <w:pPr>
+              <w:jc w:val="center"/>
+              <w:rPr>
+                <w:rFonts w:hint="eastAsia"/>
+                <w:kern w:val="0"/>
+                <w:sz w:val="21"/>
+                <w:szCs w:val="21"/>
+              </w:rPr>
+            </w:pPr>
+            <w:r>
+              <w:rPr>
+                <w:rFonts w:hint="eastAsia"/>
+                <w:kern w:val="0"/>
+                <w:sz w:val="21"/>
+                <w:szCs w:val="21"/>
+              </w:rPr>
+              <w:t>0x01</w:t>
+            </w:r>
+          </w:p>
+        </w:tc>
+        <w:tc>
+          <w:tcPr>
+            <w:tcW w:w="1702" w:type="dxa"/>
+          </w:tcPr>
+          <w:p>
+            <w:pPr>
+              <w:jc w:val="center"/>
+              <w:rPr>
+                <w:rFonts w:hint="eastAsia"/>
+                <w:kern w:val="0"/>
+                <w:sz w:val="21"/>
+                <w:szCs w:val="21"/>
+              </w:rPr>
+            </w:pPr>
+            <w:r>
+              <w:rPr>
+                <w:rFonts w:hint="eastAsia"/>
+                <w:kern w:val="0"/>
+                <w:sz w:val="21"/>
+                <w:szCs w:val="21"/>
+              </w:rPr>
+              <w:t>0</w:t>
+            </w:r>
+            <w:r>
+              <w:rPr>
+                <w:kern w:val="0"/>
+                <w:sz w:val="21"/>
+                <w:szCs w:val="21"/>
+              </w:rPr>
+              <w:t>x000F</w:t>
+            </w:r>
+          </w:p>
+        </w:tc>
+        <w:tc>
+          <w:tcPr>
+            <w:tcW w:w="850" w:type="dxa"/>
+            <w:vMerge w:val="restart"/>
+            <w:vAlign w:val="center"/>
+          </w:tcPr>
+          <w:p>
+            <w:pPr>
+              <w:jc w:val="center"/>
+              <w:rPr>
+                <w:rFonts w:hint="eastAsia"/>
+                <w:kern w:val="0"/>
+                <w:sz w:val="21"/>
+                <w:szCs w:val="21"/>
+              </w:rPr>
+            </w:pPr>
+            <w:r>
+              <w:rPr>
+                <w:rFonts w:hint="eastAsia"/>
+                <w:kern w:val="0"/>
+                <w:sz w:val="21"/>
+                <w:szCs w:val="21"/>
+              </w:rPr>
+              <w:t>CRC16</w:t>
+            </w:r>
+          </w:p>
+        </w:tc>
+        <w:tc>
+          <w:tcPr>
+            <w:tcW w:w="4394" w:type="dxa"/>
+          </w:tcPr>
+          <w:p>
+            <w:pPr>
+              <w:rPr>
+                <w:rFonts w:hint="eastAsia"/>
+                <w:kern w:val="0"/>
+                <w:sz w:val="21"/>
+                <w:szCs w:val="21"/>
+              </w:rPr>
+            </w:pPr>
+            <w:r>
+              <w:rPr>
+                <w:rFonts w:hint="eastAsia"/>
+                <w:kern w:val="0"/>
+                <w:sz w:val="21"/>
+                <w:szCs w:val="21"/>
+              </w:rPr>
+              <w:t>找到</w:t>
+            </w:r>
+            <w:r>
+              <w:rPr>
+                <w:kern w:val="0"/>
+                <w:sz w:val="21"/>
+                <w:szCs w:val="21"/>
+              </w:rPr>
+              <w:t>原点</w:t>
+            </w:r>
+          </w:p>
+        </w:tc>
+      </w:tr>
+      <w:tr>
+        <w:tblPrEx>
+          <w:tblBorders>
+            <w:top w:val="single" w:color="auto" w:sz="4" w:space="0"/>
+            <w:left w:val="single" w:color="auto" w:sz="4" w:space="0"/>
+            <w:bottom w:val="single" w:color="auto" w:sz="4" w:space="0"/>
+            <w:right w:val="single" w:color="auto" w:sz="4" w:space="0"/>
+            <w:insideH w:val="single" w:color="auto" w:sz="4" w:space="0"/>
+            <w:insideV w:val="single" w:color="auto" w:sz="4" w:space="0"/>
+          </w:tblBorders>
+          <w:tblCellMar>
+            <w:top w:w="0" w:type="dxa"/>
+            <w:left w:w="108" w:type="dxa"/>
+            <w:bottom w:w="0" w:type="dxa"/>
+            <w:right w:w="108" w:type="dxa"/>
+          </w:tblCellMar>
+        </w:tblPrEx>
+        <w:tc>
+          <w:tcPr>
+            <w:tcW w:w="993" w:type="dxa"/>
+            <w:vMerge w:val="continue"/>
+          </w:tcPr>
+          <w:p>
+            <w:pPr>
+              <w:rPr>
+                <w:rFonts w:hint="eastAsia"/>
+                <w:kern w:val="0"/>
+                <w:sz w:val="21"/>
+                <w:szCs w:val="21"/>
+              </w:rPr>
+            </w:pPr>
+          </w:p>
+        </w:tc>
+        <w:tc>
+          <w:tcPr>
+            <w:tcW w:w="708" w:type="dxa"/>
+          </w:tcPr>
+          <w:p>
+            <w:pPr>
+              <w:jc w:val="center"/>
+              <w:rPr>
+                <w:rFonts w:hint="eastAsia"/>
+                <w:kern w:val="0"/>
+                <w:sz w:val="21"/>
+                <w:szCs w:val="21"/>
+              </w:rPr>
+            </w:pPr>
+            <w:r>
+              <w:rPr>
+                <w:rFonts w:hint="eastAsia"/>
+                <w:kern w:val="0"/>
+                <w:sz w:val="21"/>
+                <w:szCs w:val="21"/>
+              </w:rPr>
+              <w:t>0x02</w:t>
+            </w:r>
+          </w:p>
+        </w:tc>
+        <w:tc>
+          <w:tcPr>
+            <w:tcW w:w="1702" w:type="dxa"/>
+          </w:tcPr>
+          <w:p>
+            <w:pPr>
+              <w:jc w:val="center"/>
+              <w:rPr>
+                <w:rFonts w:hint="eastAsia"/>
+                <w:kern w:val="0"/>
+                <w:sz w:val="21"/>
+                <w:szCs w:val="21"/>
+              </w:rPr>
+            </w:pPr>
+            <w:r>
+              <w:rPr>
+                <w:rFonts w:hint="eastAsia"/>
+                <w:kern w:val="0"/>
+                <w:sz w:val="21"/>
+                <w:szCs w:val="21"/>
+              </w:rPr>
+              <w:t>0x000A</w:t>
+            </w:r>
+          </w:p>
+        </w:tc>
+        <w:tc>
+          <w:tcPr>
+            <w:tcW w:w="850" w:type="dxa"/>
+            <w:vMerge w:val="continue"/>
+          </w:tcPr>
+          <w:p>
+            <w:pPr>
+              <w:jc w:val="center"/>
+              <w:rPr>
+                <w:rFonts w:hint="eastAsia"/>
+                <w:kern w:val="0"/>
+                <w:sz w:val="21"/>
+                <w:szCs w:val="21"/>
+              </w:rPr>
+            </w:pPr>
+          </w:p>
+        </w:tc>
+        <w:tc>
+          <w:tcPr>
+            <w:tcW w:w="4394" w:type="dxa"/>
+          </w:tcPr>
+          <w:p>
+            <w:pPr>
+              <w:rPr>
+                <w:rFonts w:hint="eastAsia"/>
+                <w:kern w:val="0"/>
+                <w:sz w:val="21"/>
+                <w:szCs w:val="21"/>
+              </w:rPr>
+            </w:pPr>
+            <w:r>
+              <w:rPr>
+                <w:rFonts w:hint="eastAsia"/>
+                <w:kern w:val="0"/>
+                <w:sz w:val="21"/>
+                <w:szCs w:val="21"/>
+              </w:rPr>
+              <w:t>移动</w:t>
+            </w:r>
+            <w:r>
+              <w:rPr>
+                <w:kern w:val="0"/>
+                <w:sz w:val="21"/>
+                <w:szCs w:val="21"/>
+              </w:rPr>
+              <w:t>到位</w:t>
             </w:r>
           </w:p>
         </w:tc>
@@ -9176,28 +9489,778 @@
         <w:tc>
           <w:tcPr>
             <w:tcW w:w="993" w:type="dxa"/>
-            <w:vMerge w:val="restart"/>
+            <w:vMerge w:val="continue"/>
+          </w:tcPr>
+          <w:p>
+            <w:pPr>
+              <w:rPr>
+                <w:rFonts w:hint="eastAsia"/>
+                <w:kern w:val="0"/>
+                <w:sz w:val="21"/>
+                <w:szCs w:val="21"/>
+              </w:rPr>
+            </w:pPr>
+          </w:p>
+        </w:tc>
+        <w:tc>
+          <w:tcPr>
+            <w:tcW w:w="708" w:type="dxa"/>
+          </w:tcPr>
+          <w:p>
+            <w:pPr>
+              <w:jc w:val="center"/>
+              <w:rPr>
+                <w:rFonts w:hint="eastAsia"/>
+                <w:color w:val="EE0000"/>
+                <w:kern w:val="0"/>
+                <w:sz w:val="21"/>
+                <w:szCs w:val="21"/>
+              </w:rPr>
+            </w:pPr>
+            <w:r>
+              <w:rPr>
+                <w:rFonts w:hint="eastAsia"/>
+                <w:color w:val="EE0000"/>
+                <w:kern w:val="0"/>
+                <w:sz w:val="21"/>
+                <w:szCs w:val="21"/>
+              </w:rPr>
+              <w:t>0</w:t>
+            </w:r>
+            <w:r>
+              <w:rPr>
+                <w:color w:val="EE0000"/>
+                <w:kern w:val="0"/>
+                <w:sz w:val="21"/>
+                <w:szCs w:val="21"/>
+              </w:rPr>
+              <w:t>x03</w:t>
+            </w:r>
+          </w:p>
+        </w:tc>
+        <w:tc>
+          <w:tcPr>
+            <w:tcW w:w="1702" w:type="dxa"/>
+          </w:tcPr>
+          <w:p>
+            <w:pPr>
+              <w:jc w:val="center"/>
+              <w:rPr>
+                <w:rFonts w:hint="eastAsia"/>
+                <w:color w:val="EE0000"/>
+                <w:kern w:val="0"/>
+                <w:sz w:val="21"/>
+                <w:szCs w:val="21"/>
+              </w:rPr>
+            </w:pPr>
+            <w:r>
+              <w:rPr>
+                <w:rFonts w:hint="eastAsia"/>
+                <w:color w:val="EE0000"/>
+                <w:kern w:val="0"/>
+                <w:sz w:val="21"/>
+                <w:szCs w:val="21"/>
+              </w:rPr>
+              <w:t>0x000E</w:t>
+            </w:r>
+          </w:p>
+        </w:tc>
+        <w:tc>
+          <w:tcPr>
+            <w:tcW w:w="850" w:type="dxa"/>
+            <w:vMerge w:val="continue"/>
+          </w:tcPr>
+          <w:p>
+            <w:pPr>
+              <w:jc w:val="center"/>
+              <w:rPr>
+                <w:rFonts w:hint="eastAsia"/>
+                <w:kern w:val="0"/>
+                <w:sz w:val="21"/>
+                <w:szCs w:val="21"/>
+              </w:rPr>
+            </w:pPr>
+          </w:p>
+        </w:tc>
+        <w:tc>
+          <w:tcPr>
+            <w:tcW w:w="4394" w:type="dxa"/>
+          </w:tcPr>
+          <w:p>
+            <w:pPr>
+              <w:rPr>
+                <w:rFonts w:hint="eastAsia"/>
+                <w:color w:val="EE0000"/>
+                <w:kern w:val="0"/>
+                <w:sz w:val="21"/>
+                <w:szCs w:val="21"/>
+              </w:rPr>
+            </w:pPr>
+            <w:r>
+              <w:rPr>
+                <w:rFonts w:hint="eastAsia"/>
+                <w:color w:val="EE0000"/>
+                <w:kern w:val="0"/>
+                <w:sz w:val="21"/>
+                <w:szCs w:val="21"/>
+              </w:rPr>
+              <w:t>镜头</w:t>
+            </w:r>
+            <w:r>
+              <w:rPr>
+                <w:color w:val="EE0000"/>
+                <w:kern w:val="0"/>
+                <w:sz w:val="21"/>
+                <w:szCs w:val="21"/>
+              </w:rPr>
+              <w:t>变倍中，请求</w:t>
+            </w:r>
+            <w:r>
+              <w:rPr>
+                <w:rFonts w:hint="eastAsia"/>
+                <w:color w:val="EE0000"/>
+                <w:kern w:val="0"/>
+                <w:sz w:val="21"/>
+                <w:szCs w:val="21"/>
+              </w:rPr>
+              <w:t xml:space="preserve">无效 </w:t>
+            </w:r>
+            <w:r>
+              <w:rPr>
+                <w:rFonts w:hint="eastAsia"/>
+                <w:color w:val="EE0000"/>
+                <w:kern w:val="0"/>
+                <w:sz w:val="21"/>
+                <w:szCs w:val="21"/>
+                <w:vertAlign w:val="superscript"/>
+              </w:rPr>
+              <w:t>*</w:t>
+            </w:r>
+            <w:r>
+              <w:rPr>
+                <w:rFonts w:hint="eastAsia"/>
+                <w:b/>
+                <w:bCs/>
+                <w:color w:val="EE0000"/>
+                <w:kern w:val="0"/>
+                <w:sz w:val="21"/>
+                <w:szCs w:val="21"/>
+                <w:vertAlign w:val="superscript"/>
+              </w:rPr>
+              <w:t>1</w:t>
+            </w:r>
+          </w:p>
+        </w:tc>
+      </w:tr>
+      <w:tr>
+        <w:tblPrEx>
+          <w:tblBorders>
+            <w:top w:val="single" w:color="auto" w:sz="4" w:space="0"/>
+            <w:left w:val="single" w:color="auto" w:sz="4" w:space="0"/>
+            <w:bottom w:val="single" w:color="auto" w:sz="4" w:space="0"/>
+            <w:right w:val="single" w:color="auto" w:sz="4" w:space="0"/>
+            <w:insideH w:val="single" w:color="auto" w:sz="4" w:space="0"/>
+            <w:insideV w:val="single" w:color="auto" w:sz="4" w:space="0"/>
+          </w:tblBorders>
+          <w:tblCellMar>
+            <w:top w:w="0" w:type="dxa"/>
+            <w:left w:w="108" w:type="dxa"/>
+            <w:bottom w:w="0" w:type="dxa"/>
+            <w:right w:w="108" w:type="dxa"/>
+          </w:tblCellMar>
+        </w:tblPrEx>
+        <w:tc>
+          <w:tcPr>
+            <w:tcW w:w="993" w:type="dxa"/>
+            <w:vMerge w:val="continue"/>
+          </w:tcPr>
+          <w:p>
+            <w:pPr>
+              <w:rPr>
+                <w:rFonts w:hint="eastAsia"/>
+                <w:kern w:val="0"/>
+                <w:sz w:val="20"/>
+                <w:szCs w:val="21"/>
+              </w:rPr>
+            </w:pPr>
+          </w:p>
+        </w:tc>
+        <w:tc>
+          <w:tcPr>
+            <w:tcW w:w="708" w:type="dxa"/>
+          </w:tcPr>
+          <w:p>
+            <w:pPr>
+              <w:jc w:val="center"/>
+              <w:rPr>
+                <w:rFonts w:hint="eastAsia"/>
+                <w:color w:val="C55A11" w:themeColor="accent2" w:themeShade="BF"/>
+                <w:kern w:val="0"/>
+                <w:sz w:val="20"/>
+                <w:szCs w:val="21"/>
+              </w:rPr>
+            </w:pPr>
+            <w:r>
+              <w:rPr>
+                <w:rFonts w:hint="eastAsia"/>
+                <w:color w:val="C55A11" w:themeColor="accent2" w:themeShade="BF"/>
+                <w:kern w:val="0"/>
+                <w:sz w:val="20"/>
+                <w:szCs w:val="21"/>
+              </w:rPr>
+              <w:t>0x</w:t>
+            </w:r>
+            <w:r>
+              <w:rPr>
+                <w:color w:val="C55A11" w:themeColor="accent2" w:themeShade="BF"/>
+                <w:kern w:val="0"/>
+                <w:sz w:val="20"/>
+                <w:szCs w:val="21"/>
+              </w:rPr>
+              <w:t>04</w:t>
+            </w:r>
+          </w:p>
+        </w:tc>
+        <w:tc>
+          <w:tcPr>
+            <w:tcW w:w="1702" w:type="dxa"/>
+          </w:tcPr>
+          <w:p>
+            <w:pPr>
+              <w:jc w:val="center"/>
+              <w:rPr>
+                <w:rFonts w:hint="eastAsia"/>
+                <w:color w:val="C55A11" w:themeColor="accent2" w:themeShade="BF"/>
+                <w:kern w:val="0"/>
+                <w:sz w:val="20"/>
+                <w:szCs w:val="21"/>
+              </w:rPr>
+            </w:pPr>
+            <w:r>
+              <w:rPr>
+                <w:rFonts w:hint="eastAsia"/>
+                <w:color w:val="C55A11" w:themeColor="accent2" w:themeShade="BF"/>
+                <w:kern w:val="0"/>
+                <w:sz w:val="21"/>
+                <w:szCs w:val="21"/>
+              </w:rPr>
+              <w:t>0x00</w:t>
+            </w:r>
+            <w:r>
+              <w:rPr>
+                <w:color w:val="C55A11" w:themeColor="accent2" w:themeShade="BF"/>
+                <w:kern w:val="0"/>
+                <w:sz w:val="21"/>
+                <w:szCs w:val="21"/>
+              </w:rPr>
+              <w:t>0D</w:t>
+            </w:r>
+          </w:p>
+        </w:tc>
+        <w:tc>
+          <w:tcPr>
+            <w:tcW w:w="850" w:type="dxa"/>
+            <w:vMerge w:val="continue"/>
+          </w:tcPr>
+          <w:p>
+            <w:pPr>
+              <w:jc w:val="center"/>
+              <w:rPr>
+                <w:rFonts w:hint="eastAsia"/>
+                <w:color w:val="C55A11" w:themeColor="accent2" w:themeShade="BF"/>
+                <w:kern w:val="0"/>
+                <w:sz w:val="20"/>
+                <w:szCs w:val="21"/>
+              </w:rPr>
+            </w:pPr>
+          </w:p>
+        </w:tc>
+        <w:tc>
+          <w:tcPr>
+            <w:tcW w:w="4394" w:type="dxa"/>
+          </w:tcPr>
+          <w:p>
+            <w:pPr>
+              <w:rPr>
+                <w:rFonts w:hint="eastAsia"/>
+                <w:color w:val="C55A11" w:themeColor="accent2" w:themeShade="BF"/>
+                <w:kern w:val="0"/>
+                <w:sz w:val="20"/>
+                <w:szCs w:val="21"/>
+              </w:rPr>
+            </w:pPr>
+            <w:r>
+              <w:rPr>
+                <w:rFonts w:hint="eastAsia"/>
+                <w:color w:val="C55A11" w:themeColor="accent2" w:themeShade="BF"/>
+                <w:kern w:val="0"/>
+                <w:sz w:val="20"/>
+                <w:szCs w:val="21"/>
+              </w:rPr>
+              <w:t>超声波</w:t>
+            </w:r>
+            <w:r>
+              <w:rPr>
+                <w:color w:val="C55A11" w:themeColor="accent2" w:themeShade="BF"/>
+                <w:kern w:val="0"/>
+                <w:sz w:val="20"/>
+                <w:szCs w:val="21"/>
+              </w:rPr>
+              <w:t>电机</w:t>
+            </w:r>
+            <w:r>
+              <w:rPr>
+                <w:rFonts w:hint="eastAsia"/>
+                <w:color w:val="C55A11" w:themeColor="accent2" w:themeShade="BF"/>
+                <w:kern w:val="0"/>
+                <w:sz w:val="20"/>
+                <w:szCs w:val="21"/>
+              </w:rPr>
+              <w:t>扫描完成</w:t>
+            </w:r>
+          </w:p>
+        </w:tc>
+      </w:tr>
+      <w:tr>
+        <w:tblPrEx>
+          <w:tblBorders>
+            <w:top w:val="single" w:color="auto" w:sz="4" w:space="0"/>
+            <w:left w:val="single" w:color="auto" w:sz="4" w:space="0"/>
+            <w:bottom w:val="single" w:color="auto" w:sz="4" w:space="0"/>
+            <w:right w:val="single" w:color="auto" w:sz="4" w:space="0"/>
+            <w:insideH w:val="single" w:color="auto" w:sz="4" w:space="0"/>
+            <w:insideV w:val="single" w:color="auto" w:sz="4" w:space="0"/>
+          </w:tblBorders>
+          <w:tblCellMar>
+            <w:top w:w="0" w:type="dxa"/>
+            <w:left w:w="108" w:type="dxa"/>
+            <w:bottom w:w="0" w:type="dxa"/>
+            <w:right w:w="108" w:type="dxa"/>
+          </w:tblCellMar>
+        </w:tblPrEx>
+        <w:tc>
+          <w:tcPr>
+            <w:tcW w:w="993" w:type="dxa"/>
+            <w:vMerge w:val="continue"/>
+          </w:tcPr>
+          <w:p>
+            <w:pPr>
+              <w:rPr>
+                <w:rFonts w:hint="eastAsia"/>
+                <w:kern w:val="0"/>
+                <w:sz w:val="20"/>
+                <w:szCs w:val="21"/>
+              </w:rPr>
+            </w:pPr>
+          </w:p>
+        </w:tc>
+        <w:tc>
+          <w:tcPr>
+            <w:tcW w:w="708" w:type="dxa"/>
+          </w:tcPr>
+          <w:p>
+            <w:pPr>
+              <w:jc w:val="center"/>
+              <w:rPr>
+                <w:rFonts w:hint="eastAsia"/>
+                <w:color w:val="C55A11" w:themeColor="accent2" w:themeShade="BF"/>
+                <w:kern w:val="0"/>
+                <w:sz w:val="20"/>
+                <w:szCs w:val="21"/>
+              </w:rPr>
+            </w:pPr>
+            <w:r>
+              <w:rPr>
+                <w:rFonts w:hint="eastAsia"/>
+                <w:color w:val="C55A11" w:themeColor="accent2" w:themeShade="BF"/>
+                <w:kern w:val="0"/>
+                <w:sz w:val="20"/>
+                <w:szCs w:val="21"/>
+              </w:rPr>
+              <w:t>0x</w:t>
+            </w:r>
+            <w:r>
+              <w:rPr>
+                <w:color w:val="C55A11" w:themeColor="accent2" w:themeShade="BF"/>
+                <w:kern w:val="0"/>
+                <w:sz w:val="20"/>
+                <w:szCs w:val="21"/>
+              </w:rPr>
+              <w:t>05</w:t>
+            </w:r>
+          </w:p>
+        </w:tc>
+        <w:tc>
+          <w:tcPr>
+            <w:tcW w:w="1702" w:type="dxa"/>
+          </w:tcPr>
+          <w:p>
+            <w:pPr>
+              <w:jc w:val="center"/>
+              <w:rPr>
+                <w:rFonts w:hint="eastAsia"/>
+                <w:color w:val="C55A11" w:themeColor="accent2" w:themeShade="BF"/>
+                <w:kern w:val="0"/>
+                <w:sz w:val="20"/>
+                <w:szCs w:val="21"/>
+              </w:rPr>
+            </w:pPr>
+            <w:r>
+              <w:rPr>
+                <w:rFonts w:hint="eastAsia"/>
+                <w:color w:val="ED7D31" w:themeColor="accent2"/>
+                <w:kern w:val="0"/>
+                <w:sz w:val="21"/>
+                <w:szCs w:val="21"/>
+                <w14:textFill>
+                  <w14:solidFill>
+                    <w14:schemeClr w14:val="accent2"/>
+                  </w14:solidFill>
+                </w14:textFill>
+              </w:rPr>
+              <w:t>0</w:t>
+            </w:r>
+            <w:r>
+              <w:rPr>
+                <w:color w:val="ED7D31" w:themeColor="accent2"/>
+                <w:kern w:val="0"/>
+                <w:sz w:val="21"/>
+                <w:szCs w:val="21"/>
+                <w14:textFill>
+                  <w14:solidFill>
+                    <w14:schemeClr w14:val="accent2"/>
+                  </w14:solidFill>
+                </w14:textFill>
+              </w:rPr>
+              <w:t>xXXXX</w:t>
+            </w:r>
+          </w:p>
+        </w:tc>
+        <w:tc>
+          <w:tcPr>
+            <w:tcW w:w="850" w:type="dxa"/>
+            <w:vMerge w:val="continue"/>
+          </w:tcPr>
+          <w:p>
+            <w:pPr>
+              <w:jc w:val="center"/>
+              <w:rPr>
+                <w:rFonts w:hint="eastAsia"/>
+                <w:color w:val="C55A11" w:themeColor="accent2" w:themeShade="BF"/>
+                <w:kern w:val="0"/>
+                <w:sz w:val="20"/>
+                <w:szCs w:val="21"/>
+              </w:rPr>
+            </w:pPr>
+          </w:p>
+        </w:tc>
+        <w:tc>
+          <w:tcPr>
+            <w:tcW w:w="4394" w:type="dxa"/>
+          </w:tcPr>
+          <w:p>
+            <w:pPr>
+              <w:rPr>
+                <w:rFonts w:hint="eastAsia"/>
+                <w:color w:val="C55A11" w:themeColor="accent2" w:themeShade="BF"/>
+                <w:kern w:val="0"/>
+                <w:sz w:val="20"/>
+                <w:szCs w:val="21"/>
+              </w:rPr>
+            </w:pPr>
+            <w:r>
+              <w:rPr>
+                <w:rFonts w:hint="eastAsia"/>
+                <w:color w:val="C55A11" w:themeColor="accent2" w:themeShade="BF"/>
+                <w:kern w:val="0"/>
+                <w:sz w:val="20"/>
+                <w:szCs w:val="21"/>
+              </w:rPr>
+              <w:t>超声波</w:t>
+            </w:r>
+            <w:r>
+              <w:rPr>
+                <w:color w:val="C55A11" w:themeColor="accent2" w:themeShade="BF"/>
+                <w:kern w:val="0"/>
+                <w:sz w:val="20"/>
+                <w:szCs w:val="21"/>
+              </w:rPr>
+              <w:t>电机</w:t>
+            </w:r>
+            <w:r>
+              <w:rPr>
+                <w:rFonts w:hint="eastAsia"/>
+                <w:color w:val="C55A11" w:themeColor="accent2" w:themeShade="BF"/>
+                <w:kern w:val="0"/>
+                <w:sz w:val="20"/>
+                <w:szCs w:val="21"/>
+              </w:rPr>
+              <w:t>最佳频点</w:t>
+            </w:r>
+          </w:p>
+        </w:tc>
+      </w:tr>
+      <w:tr>
+        <w:tblPrEx>
+          <w:tblBorders>
+            <w:top w:val="single" w:color="auto" w:sz="4" w:space="0"/>
+            <w:left w:val="single" w:color="auto" w:sz="4" w:space="0"/>
+            <w:bottom w:val="single" w:color="auto" w:sz="4" w:space="0"/>
+            <w:right w:val="single" w:color="auto" w:sz="4" w:space="0"/>
+            <w:insideH w:val="single" w:color="auto" w:sz="4" w:space="0"/>
+            <w:insideV w:val="single" w:color="auto" w:sz="4" w:space="0"/>
+          </w:tblBorders>
+          <w:tblCellMar>
+            <w:top w:w="0" w:type="dxa"/>
+            <w:left w:w="108" w:type="dxa"/>
+            <w:bottom w:w="0" w:type="dxa"/>
+            <w:right w:w="108" w:type="dxa"/>
+          </w:tblCellMar>
+        </w:tblPrEx>
+        <w:tc>
+          <w:tcPr>
+            <w:tcW w:w="993" w:type="dxa"/>
+            <w:vMerge w:val="continue"/>
+          </w:tcPr>
+          <w:p>
+            <w:pPr>
+              <w:rPr>
+                <w:rFonts w:hint="eastAsia"/>
+                <w:kern w:val="0"/>
+                <w:sz w:val="20"/>
+                <w:szCs w:val="21"/>
+              </w:rPr>
+            </w:pPr>
+          </w:p>
+        </w:tc>
+        <w:tc>
+          <w:tcPr>
+            <w:tcW w:w="708" w:type="dxa"/>
+          </w:tcPr>
+          <w:p>
+            <w:pPr>
+              <w:jc w:val="center"/>
+              <w:rPr>
+                <w:rFonts w:hint="eastAsia"/>
+                <w:color w:val="C55A11" w:themeColor="accent2" w:themeShade="BF"/>
+                <w:kern w:val="0"/>
+                <w:sz w:val="20"/>
+                <w:szCs w:val="21"/>
+              </w:rPr>
+            </w:pPr>
+            <w:r>
+              <w:rPr>
+                <w:rFonts w:hint="eastAsia"/>
+                <w:color w:val="C55A11" w:themeColor="accent2" w:themeShade="BF"/>
+                <w:kern w:val="0"/>
+                <w:sz w:val="20"/>
+                <w:szCs w:val="21"/>
+              </w:rPr>
+              <w:t>0x</w:t>
+            </w:r>
+            <w:r>
+              <w:rPr>
+                <w:color w:val="C55A11" w:themeColor="accent2" w:themeShade="BF"/>
+                <w:kern w:val="0"/>
+                <w:sz w:val="20"/>
+                <w:szCs w:val="21"/>
+              </w:rPr>
+              <w:t>06</w:t>
+            </w:r>
+          </w:p>
+        </w:tc>
+        <w:tc>
+          <w:tcPr>
+            <w:tcW w:w="1702" w:type="dxa"/>
+          </w:tcPr>
+          <w:p>
+            <w:pPr>
+              <w:jc w:val="center"/>
+              <w:rPr>
+                <w:rFonts w:hint="eastAsia"/>
+                <w:color w:val="C55A11" w:themeColor="accent2" w:themeShade="BF"/>
+                <w:kern w:val="0"/>
+                <w:sz w:val="20"/>
+                <w:szCs w:val="21"/>
+              </w:rPr>
+            </w:pPr>
+            <w:r>
+              <w:rPr>
+                <w:rFonts w:hint="eastAsia"/>
+                <w:color w:val="ED7D31" w:themeColor="accent2"/>
+                <w:kern w:val="0"/>
+                <w:sz w:val="21"/>
+                <w:szCs w:val="21"/>
+                <w14:textFill>
+                  <w14:solidFill>
+                    <w14:schemeClr w14:val="accent2"/>
+                  </w14:solidFill>
+                </w14:textFill>
+              </w:rPr>
+              <w:t>0</w:t>
+            </w:r>
+            <w:r>
+              <w:rPr>
+                <w:color w:val="ED7D31" w:themeColor="accent2"/>
+                <w:kern w:val="0"/>
+                <w:sz w:val="21"/>
+                <w:szCs w:val="21"/>
+                <w14:textFill>
+                  <w14:solidFill>
+                    <w14:schemeClr w14:val="accent2"/>
+                  </w14:solidFill>
+                </w14:textFill>
+              </w:rPr>
+              <w:t>xXXXX</w:t>
+            </w:r>
+          </w:p>
+        </w:tc>
+        <w:tc>
+          <w:tcPr>
+            <w:tcW w:w="850" w:type="dxa"/>
+            <w:vMerge w:val="continue"/>
+          </w:tcPr>
+          <w:p>
+            <w:pPr>
+              <w:jc w:val="center"/>
+              <w:rPr>
+                <w:rFonts w:hint="eastAsia"/>
+                <w:color w:val="C55A11" w:themeColor="accent2" w:themeShade="BF"/>
+                <w:kern w:val="0"/>
+                <w:sz w:val="20"/>
+                <w:szCs w:val="21"/>
+              </w:rPr>
+            </w:pPr>
+          </w:p>
+        </w:tc>
+        <w:tc>
+          <w:tcPr>
+            <w:tcW w:w="4394" w:type="dxa"/>
+          </w:tcPr>
+          <w:p>
+            <w:pPr>
+              <w:rPr>
+                <w:rFonts w:hint="eastAsia"/>
+                <w:color w:val="C55A11" w:themeColor="accent2" w:themeShade="BF"/>
+                <w:kern w:val="0"/>
+                <w:sz w:val="20"/>
+                <w:szCs w:val="21"/>
+              </w:rPr>
+            </w:pPr>
+            <w:r>
+              <w:rPr>
+                <w:rFonts w:hint="eastAsia"/>
+                <w:color w:val="C55A11" w:themeColor="accent2" w:themeShade="BF"/>
+                <w:kern w:val="0"/>
+                <w:sz w:val="20"/>
+                <w:szCs w:val="21"/>
+              </w:rPr>
+              <w:t>超声波</w:t>
+            </w:r>
+            <w:r>
+              <w:rPr>
+                <w:color w:val="C55A11" w:themeColor="accent2" w:themeShade="BF"/>
+                <w:kern w:val="0"/>
+                <w:sz w:val="20"/>
+                <w:szCs w:val="21"/>
+              </w:rPr>
+              <w:t>电机</w:t>
+            </w:r>
+            <w:r>
+              <w:rPr>
+                <w:rFonts w:hint="eastAsia"/>
+                <w:color w:val="C55A11" w:themeColor="accent2" w:themeShade="BF"/>
+                <w:kern w:val="0"/>
+                <w:sz w:val="20"/>
+                <w:szCs w:val="21"/>
+              </w:rPr>
+              <w:t>最佳频点对应速度</w:t>
+            </w:r>
+          </w:p>
+        </w:tc>
+      </w:tr>
+      <w:tr>
+        <w:tblPrEx>
+          <w:tblBorders>
+            <w:top w:val="single" w:color="auto" w:sz="4" w:space="0"/>
+            <w:left w:val="single" w:color="auto" w:sz="4" w:space="0"/>
+            <w:bottom w:val="single" w:color="auto" w:sz="4" w:space="0"/>
+            <w:right w:val="single" w:color="auto" w:sz="4" w:space="0"/>
+            <w:insideH w:val="single" w:color="auto" w:sz="4" w:space="0"/>
+            <w:insideV w:val="single" w:color="auto" w:sz="4" w:space="0"/>
+          </w:tblBorders>
+          <w:tblCellMar>
+            <w:top w:w="0" w:type="dxa"/>
+            <w:left w:w="108" w:type="dxa"/>
+            <w:bottom w:w="0" w:type="dxa"/>
+            <w:right w:w="108" w:type="dxa"/>
+          </w:tblCellMar>
+        </w:tblPrEx>
+        <w:tc>
+          <w:tcPr>
+            <w:tcW w:w="993" w:type="dxa"/>
+            <w:vMerge w:val="continue"/>
+          </w:tcPr>
+          <w:p>
+            <w:pPr>
+              <w:rPr>
+                <w:rFonts w:hint="eastAsia"/>
+                <w:kern w:val="0"/>
+                <w:sz w:val="21"/>
+                <w:szCs w:val="21"/>
+              </w:rPr>
+            </w:pPr>
+          </w:p>
+        </w:tc>
+        <w:tc>
+          <w:tcPr>
+            <w:tcW w:w="7654" w:type="dxa"/>
+            <w:gridSpan w:val="4"/>
             <w:vAlign w:val="center"/>
           </w:tcPr>
           <w:p>
             <w:pPr>
-              <w:jc w:val="center"/>
-              <w:rPr>
-                <w:rFonts w:hint="eastAsia"/>
-                <w:kern w:val="0"/>
-                <w:sz w:val="21"/>
-                <w:szCs w:val="21"/>
-              </w:rPr>
-            </w:pPr>
-            <w:r>
-              <w:rPr>
-                <w:rFonts w:hint="eastAsia" w:ascii="微软雅黑" w:hAnsi="微软雅黑" w:eastAsia="微软雅黑" w:cs="微软雅黑"/>
-                <w:kern w:val="0"/>
-                <w:sz w:val="21"/>
-                <w:szCs w:val="21"/>
-              </w:rPr>
-              <w:t>0xA5</w:t>
-            </w:r>
+              <w:rPr>
+                <w:rFonts w:hint="eastAsia"/>
+                <w:kern w:val="0"/>
+                <w:sz w:val="21"/>
+                <w:szCs w:val="21"/>
+              </w:rPr>
+            </w:pPr>
+          </w:p>
+        </w:tc>
+      </w:tr>
+      <w:tr>
+        <w:tblPrEx>
+          <w:tblBorders>
+            <w:top w:val="single" w:color="auto" w:sz="4" w:space="0"/>
+            <w:left w:val="single" w:color="auto" w:sz="4" w:space="0"/>
+            <w:bottom w:val="single" w:color="auto" w:sz="4" w:space="0"/>
+            <w:right w:val="single" w:color="auto" w:sz="4" w:space="0"/>
+            <w:insideH w:val="single" w:color="auto" w:sz="4" w:space="0"/>
+            <w:insideV w:val="single" w:color="auto" w:sz="4" w:space="0"/>
+          </w:tblBorders>
+          <w:tblCellMar>
+            <w:top w:w="0" w:type="dxa"/>
+            <w:left w:w="108" w:type="dxa"/>
+            <w:bottom w:w="0" w:type="dxa"/>
+            <w:right w:w="108" w:type="dxa"/>
+          </w:tblCellMar>
+        </w:tblPrEx>
+        <w:tc>
+          <w:tcPr>
+            <w:tcW w:w="993" w:type="dxa"/>
+            <w:vMerge w:val="continue"/>
+          </w:tcPr>
+          <w:p>
+            <w:pPr>
+              <w:rPr>
+                <w:rFonts w:hint="eastAsia"/>
+                <w:kern w:val="0"/>
+                <w:sz w:val="21"/>
+                <w:szCs w:val="21"/>
+              </w:rPr>
+            </w:pPr>
           </w:p>
         </w:tc>
         <w:tc>
@@ -9221,7 +10284,15 @@
                 <w:sz w:val="21"/>
                 <w:szCs w:val="21"/>
               </w:rPr>
-              <w:t>0x01</w:t>
+              <w:t>0</w:t>
+            </w:r>
+            <w:r>
+              <w:rPr>
+                <w:kern w:val="0"/>
+                <w:sz w:val="21"/>
+                <w:szCs w:val="21"/>
+              </w:rPr>
+              <w:t>x10</w:t>
             </w:r>
           </w:p>
         </w:tc>
@@ -9246,15 +10317,7 @@
                 <w:sz w:val="21"/>
                 <w:szCs w:val="21"/>
               </w:rPr>
-              <w:t>0</w:t>
-            </w:r>
-            <w:r>
-              <w:rPr>
-                <w:kern w:val="0"/>
-                <w:sz w:val="21"/>
-                <w:szCs w:val="21"/>
-              </w:rPr>
-              <w:t>x000F</w:t>
+              <w:t>倍率</w:t>
             </w:r>
           </w:p>
         </w:tc>
@@ -9305,15 +10368,155 @@
                 <w:sz w:val="21"/>
                 <w:szCs w:val="21"/>
               </w:rPr>
-              <w:t>找到</w:t>
-            </w:r>
-            <w:r>
-              <w:rPr>
-                <w:kern w:val="0"/>
-                <w:sz w:val="21"/>
-                <w:szCs w:val="21"/>
-              </w:rPr>
-              <w:t>原点</w:t>
+              <w:t>向上位机发送镜头当前</w:t>
+            </w:r>
+            <w:r>
+              <w:rPr>
+                <w:kern w:val="0"/>
+                <w:sz w:val="21"/>
+                <w:szCs w:val="21"/>
+              </w:rPr>
+              <w:t>倍率</w:t>
+            </w:r>
+          </w:p>
+        </w:tc>
+      </w:tr>
+      <w:tr>
+        <w:tblPrEx>
+          <w:tblBorders>
+            <w:top w:val="single" w:color="auto" w:sz="4" w:space="0"/>
+            <w:left w:val="single" w:color="auto" w:sz="4" w:space="0"/>
+            <w:bottom w:val="single" w:color="auto" w:sz="4" w:space="0"/>
+            <w:right w:val="single" w:color="auto" w:sz="4" w:space="0"/>
+            <w:insideH w:val="single" w:color="auto" w:sz="4" w:space="0"/>
+            <w:insideV w:val="single" w:color="auto" w:sz="4" w:space="0"/>
+          </w:tblBorders>
+          <w:tblCellMar>
+            <w:top w:w="0" w:type="dxa"/>
+            <w:left w:w="108" w:type="dxa"/>
+            <w:bottom w:w="0" w:type="dxa"/>
+            <w:right w:w="108" w:type="dxa"/>
+          </w:tblCellMar>
+        </w:tblPrEx>
+        <w:tc>
+          <w:tcPr>
+            <w:tcW w:w="993" w:type="dxa"/>
+            <w:vMerge w:val="continue"/>
+          </w:tcPr>
+          <w:p>
+            <w:pPr>
+              <w:rPr>
+                <w:rFonts w:hint="eastAsia"/>
+                <w:kern w:val="0"/>
+                <w:sz w:val="21"/>
+                <w:szCs w:val="21"/>
+              </w:rPr>
+            </w:pPr>
+          </w:p>
+        </w:tc>
+        <w:tc>
+          <w:tcPr>
+            <w:tcW w:w="708" w:type="dxa"/>
+          </w:tcPr>
+          <w:p>
+            <w:pPr>
+              <w:jc w:val="center"/>
+              <w:rPr>
+                <w:rFonts w:hint="eastAsia"/>
+                <w:kern w:val="0"/>
+                <w:sz w:val="21"/>
+                <w:szCs w:val="21"/>
+              </w:rPr>
+            </w:pPr>
+            <w:r>
+              <w:rPr>
+                <w:rFonts w:hint="eastAsia"/>
+                <w:kern w:val="0"/>
+                <w:sz w:val="21"/>
+                <w:szCs w:val="21"/>
+              </w:rPr>
+              <w:t>0x</w:t>
+            </w:r>
+            <w:r>
+              <w:rPr>
+                <w:kern w:val="0"/>
+                <w:sz w:val="21"/>
+                <w:szCs w:val="21"/>
+              </w:rPr>
+              <w:t>11</w:t>
+            </w:r>
+          </w:p>
+        </w:tc>
+        <w:tc>
+          <w:tcPr>
+            <w:tcW w:w="1702" w:type="dxa"/>
+          </w:tcPr>
+          <w:p>
+            <w:pPr>
+              <w:jc w:val="center"/>
+              <w:rPr>
+                <w:rFonts w:hint="eastAsia"/>
+                <w:kern w:val="0"/>
+                <w:sz w:val="21"/>
+                <w:szCs w:val="21"/>
+              </w:rPr>
+            </w:pPr>
+            <w:r>
+              <w:rPr>
+                <w:kern w:val="0"/>
+                <w:sz w:val="21"/>
+                <w:szCs w:val="21"/>
+              </w:rPr>
+              <w:t>状态</w:t>
+            </w:r>
+          </w:p>
+        </w:tc>
+        <w:tc>
+          <w:tcPr>
+            <w:tcW w:w="850" w:type="dxa"/>
+            <w:vMerge w:val="continue"/>
+          </w:tcPr>
+          <w:p>
+            <w:pPr>
+              <w:jc w:val="center"/>
+              <w:rPr>
+                <w:rFonts w:hint="eastAsia"/>
+                <w:kern w:val="0"/>
+                <w:sz w:val="21"/>
+                <w:szCs w:val="21"/>
+              </w:rPr>
+            </w:pPr>
+          </w:p>
+        </w:tc>
+        <w:tc>
+          <w:tcPr>
+            <w:tcW w:w="4394" w:type="dxa"/>
+          </w:tcPr>
+          <w:p>
+            <w:pPr>
+              <w:rPr>
+                <w:rFonts w:hint="eastAsia"/>
+                <w:kern w:val="0"/>
+                <w:sz w:val="21"/>
+                <w:szCs w:val="21"/>
+              </w:rPr>
+            </w:pPr>
+            <w:r>
+              <w:rPr>
+                <w:rFonts w:hint="eastAsia"/>
+                <w:kern w:val="0"/>
+                <w:sz w:val="21"/>
+                <w:szCs w:val="21"/>
+              </w:rPr>
+              <w:t>向上位机发送镜头运行</w:t>
+            </w:r>
+            <w:r>
+              <w:rPr>
+                <w:kern w:val="0"/>
+                <w:sz w:val="21"/>
+                <w:szCs w:val="21"/>
+              </w:rPr>
+              <w:t>状态</w:t>
             </w:r>
           </w:p>
         </w:tc>
@@ -9354,19 +10557,45 @@
               <w:jc w:val="center"/>
               <w:rPr>
                 <w:rFonts w:hint="eastAsia"/>
-                <w:kern w:val="0"/>
-                <w:sz w:val="21"/>
-                <w:szCs w:val="21"/>
-              </w:rPr>
-            </w:pPr>
-            <w:r>
-              <w:rPr>
-                <w:rFonts w:hint="eastAsia"/>
-                <w:kern w:val="0"/>
-                <w:sz w:val="21"/>
-                <w:szCs w:val="21"/>
-              </w:rPr>
-              <w:t>0x02</w:t>
+                <w:color w:val="ED7D31" w:themeColor="accent2"/>
+                <w:kern w:val="0"/>
+                <w:sz w:val="21"/>
+                <w:szCs w:val="21"/>
+                <w14:textFill>
+                  <w14:solidFill>
+                    <w14:schemeClr w14:val="accent2"/>
+                  </w14:solidFill>
+                </w14:textFill>
+              </w:rPr>
+            </w:pPr>
+            <w:r>
+              <w:rPr>
+                <w:rFonts w:hint="eastAsia"/>
+                <w:color w:val="ED7D31" w:themeColor="accent2"/>
+                <w:kern w:val="0"/>
+                <w:sz w:val="21"/>
+                <w:szCs w:val="21"/>
+                <w14:textFill>
+                  <w14:solidFill>
+                    <w14:schemeClr w14:val="accent2"/>
+                  </w14:solidFill>
+                </w14:textFill>
+              </w:rPr>
+              <w:t>0x</w:t>
+            </w:r>
+            <w:r>
+              <w:rPr>
+                <w:color w:val="ED7D31" w:themeColor="accent2"/>
+                <w:kern w:val="0"/>
+                <w:sz w:val="21"/>
+                <w:szCs w:val="21"/>
+                <w14:textFill>
+                  <w14:solidFill>
+                    <w14:schemeClr w14:val="accent2"/>
+                  </w14:solidFill>
+                </w14:textFill>
+              </w:rPr>
+              <w:t>12</w:t>
             </w:r>
           </w:p>
         </w:tc>
@@ -9379,19 +10608,31 @@
               <w:jc w:val="center"/>
               <w:rPr>
                 <w:rFonts w:hint="eastAsia"/>
-                <w:kern w:val="0"/>
-                <w:sz w:val="21"/>
-                <w:szCs w:val="21"/>
-              </w:rPr>
-            </w:pPr>
-            <w:r>
-              <w:rPr>
-                <w:rFonts w:hint="eastAsia"/>
-                <w:kern w:val="0"/>
-                <w:sz w:val="21"/>
-                <w:szCs w:val="21"/>
-              </w:rPr>
-              <w:t>0x000A</w:t>
+                <w:color w:val="ED7D31" w:themeColor="accent2"/>
+                <w:kern w:val="0"/>
+                <w:sz w:val="21"/>
+                <w:szCs w:val="21"/>
+                <w14:textFill>
+                  <w14:solidFill>
+                    <w14:schemeClr w14:val="accent2"/>
+                  </w14:solidFill>
+                </w14:textFill>
+              </w:rPr>
+            </w:pPr>
+            <w:r>
+              <w:rPr>
+                <w:rFonts w:hint="eastAsia"/>
+                <w:color w:val="ED7D31" w:themeColor="accent2"/>
+                <w:kern w:val="0"/>
+                <w:sz w:val="21"/>
+                <w:szCs w:val="21"/>
+                <w14:textFill>
+                  <w14:solidFill>
+                    <w14:schemeClr w14:val="accent2"/>
+                  </w14:solidFill>
+                </w14:textFill>
+              </w:rPr>
+              <w:t>速度</w:t>
             </w:r>
           </w:p>
         </w:tc>
@@ -9399,15 +10640,22 @@
           <w:tcPr>
             <w:tcW w:w="850" w:type="dxa"/>
             <w:vMerge w:val="continue"/>
-          </w:tcPr>
-          <w:p>
-            <w:pPr>
-              <w:jc w:val="center"/>
-              <w:rPr>
-                <w:rFonts w:hint="eastAsia"/>
-                <w:kern w:val="0"/>
-                <w:sz w:val="21"/>
-                <w:szCs w:val="21"/>
+            <w:vAlign w:val="center"/>
+          </w:tcPr>
+          <w:p>
+            <w:pPr>
+              <w:jc w:val="center"/>
+              <w:rPr>
+                <w:rFonts w:hint="eastAsia"/>
+                <w:color w:val="ED7D31" w:themeColor="accent2"/>
+                <w:kern w:val="0"/>
+                <w:sz w:val="21"/>
+                <w:szCs w:val="21"/>
+                <w14:textFill>
+                  <w14:solidFill>
+                    <w14:schemeClr w14:val="accent2"/>
+                  </w14:solidFill>
+                </w14:textFill>
               </w:rPr>
             </w:pPr>
           </w:p>
@@ -9420,27 +10668,535 @@
             <w:pPr>
               <w:rPr>
                 <w:rFonts w:hint="eastAsia"/>
-                <w:kern w:val="0"/>
-                <w:sz w:val="21"/>
-                <w:szCs w:val="21"/>
-              </w:rPr>
-            </w:pPr>
-            <w:r>
-              <w:rPr>
-                <w:rFonts w:hint="eastAsia"/>
-                <w:kern w:val="0"/>
-                <w:sz w:val="21"/>
-                <w:szCs w:val="21"/>
-              </w:rPr>
-              <w:t>移动</w:t>
-            </w:r>
-            <w:r>
-              <w:rPr>
-                <w:kern w:val="0"/>
-                <w:sz w:val="21"/>
-                <w:szCs w:val="21"/>
-              </w:rPr>
-              <w:t>到位</w:t>
+                <w:color w:val="ED7D31" w:themeColor="accent2"/>
+                <w:kern w:val="0"/>
+                <w:sz w:val="21"/>
+                <w:szCs w:val="21"/>
+                <w14:textFill>
+                  <w14:solidFill>
+                    <w14:schemeClr w14:val="accent2"/>
+                  </w14:solidFill>
+                </w14:textFill>
+              </w:rPr>
+            </w:pPr>
+            <w:r>
+              <w:rPr>
+                <w:rFonts w:hint="eastAsia"/>
+                <w:color w:val="ED7D31" w:themeColor="accent2"/>
+                <w:kern w:val="0"/>
+                <w:sz w:val="21"/>
+                <w:szCs w:val="21"/>
+                <w14:textFill>
+                  <w14:solidFill>
+                    <w14:schemeClr w14:val="accent2"/>
+                  </w14:solidFill>
+                </w14:textFill>
+              </w:rPr>
+              <w:t>向上位机发送镜头运行</w:t>
+            </w:r>
+            <w:r>
+              <w:rPr>
+                <w:color w:val="ED7D31" w:themeColor="accent2"/>
+                <w:kern w:val="0"/>
+                <w:sz w:val="21"/>
+                <w:szCs w:val="21"/>
+                <w14:textFill>
+                  <w14:solidFill>
+                    <w14:schemeClr w14:val="accent2"/>
+                  </w14:solidFill>
+                </w14:textFill>
+              </w:rPr>
+              <w:t>速度</w:t>
+            </w:r>
+          </w:p>
+        </w:tc>
+      </w:tr>
+      <w:tr>
+        <w:tblPrEx>
+          <w:tblBorders>
+            <w:top w:val="single" w:color="auto" w:sz="4" w:space="0"/>
+            <w:left w:val="single" w:color="auto" w:sz="4" w:space="0"/>
+            <w:bottom w:val="single" w:color="auto" w:sz="4" w:space="0"/>
+            <w:right w:val="single" w:color="auto" w:sz="4" w:space="0"/>
+            <w:insideH w:val="single" w:color="auto" w:sz="4" w:space="0"/>
+            <w:insideV w:val="single" w:color="auto" w:sz="4" w:space="0"/>
+          </w:tblBorders>
+          <w:tblCellMar>
+            <w:top w:w="0" w:type="dxa"/>
+            <w:left w:w="108" w:type="dxa"/>
+            <w:bottom w:w="0" w:type="dxa"/>
+            <w:right w:w="108" w:type="dxa"/>
+          </w:tblCellMar>
+        </w:tblPrEx>
+        <w:tc>
+          <w:tcPr>
+            <w:tcW w:w="993" w:type="dxa"/>
+            <w:vMerge w:val="continue"/>
+          </w:tcPr>
+          <w:p>
+            <w:pPr>
+              <w:rPr>
+                <w:rFonts w:hint="eastAsia"/>
+                <w:kern w:val="0"/>
+                <w:sz w:val="20"/>
+                <w:szCs w:val="21"/>
+              </w:rPr>
+            </w:pPr>
+          </w:p>
+        </w:tc>
+        <w:tc>
+          <w:tcPr>
+            <w:tcW w:w="708" w:type="dxa"/>
+          </w:tcPr>
+          <w:p>
+            <w:pPr>
+              <w:jc w:val="center"/>
+              <w:rPr>
+                <w:rFonts w:hint="eastAsia"/>
+                <w:color w:val="ED7D31" w:themeColor="accent2"/>
+                <w:kern w:val="0"/>
+                <w:sz w:val="20"/>
+                <w:szCs w:val="21"/>
+                <w14:textFill>
+                  <w14:solidFill>
+                    <w14:schemeClr w14:val="accent2"/>
+                  </w14:solidFill>
+                </w14:textFill>
+              </w:rPr>
+            </w:pPr>
+            <w:r>
+              <w:rPr>
+                <w:rFonts w:hint="eastAsia"/>
+                <w:color w:val="ED7D31" w:themeColor="accent2"/>
+                <w:kern w:val="0"/>
+                <w:sz w:val="21"/>
+                <w:szCs w:val="21"/>
+                <w14:textFill>
+                  <w14:solidFill>
+                    <w14:schemeClr w14:val="accent2"/>
+                  </w14:solidFill>
+                </w14:textFill>
+              </w:rPr>
+              <w:t>0x</w:t>
+            </w:r>
+            <w:r>
+              <w:rPr>
+                <w:color w:val="ED7D31" w:themeColor="accent2"/>
+                <w:kern w:val="0"/>
+                <w:sz w:val="21"/>
+                <w:szCs w:val="21"/>
+                <w14:textFill>
+                  <w14:solidFill>
+                    <w14:schemeClr w14:val="accent2"/>
+                  </w14:solidFill>
+                </w14:textFill>
+              </w:rPr>
+              <w:t>13</w:t>
+            </w:r>
+          </w:p>
+        </w:tc>
+        <w:tc>
+          <w:tcPr>
+            <w:tcW w:w="1702" w:type="dxa"/>
+          </w:tcPr>
+          <w:p>
+            <w:pPr>
+              <w:jc w:val="center"/>
+              <w:rPr>
+                <w:rFonts w:hint="eastAsia"/>
+                <w:color w:val="ED7D31" w:themeColor="accent2"/>
+                <w:kern w:val="0"/>
+                <w:sz w:val="20"/>
+                <w:szCs w:val="21"/>
+                <w14:textFill>
+                  <w14:solidFill>
+                    <w14:schemeClr w14:val="accent2"/>
+                  </w14:solidFill>
+                </w14:textFill>
+              </w:rPr>
+            </w:pPr>
+            <w:r>
+              <w:rPr>
+                <w:rFonts w:hint="eastAsia"/>
+                <w:color w:val="ED7D31" w:themeColor="accent2"/>
+                <w:kern w:val="0"/>
+                <w:sz w:val="20"/>
+                <w:szCs w:val="21"/>
+                <w14:textFill>
+                  <w14:solidFill>
+                    <w14:schemeClr w14:val="accent2"/>
+                  </w14:solidFill>
+                </w14:textFill>
+              </w:rPr>
+              <w:t>类型</w:t>
+            </w:r>
+          </w:p>
+        </w:tc>
+        <w:tc>
+          <w:tcPr>
+            <w:tcW w:w="850" w:type="dxa"/>
+            <w:vMerge w:val="continue"/>
+            <w:vAlign w:val="center"/>
+          </w:tcPr>
+          <w:p>
+            <w:pPr>
+              <w:jc w:val="center"/>
+              <w:rPr>
+                <w:rFonts w:hint="eastAsia"/>
+                <w:color w:val="ED7D31" w:themeColor="accent2"/>
+                <w:kern w:val="0"/>
+                <w:sz w:val="20"/>
+                <w:szCs w:val="21"/>
+                <w14:textFill>
+                  <w14:solidFill>
+                    <w14:schemeClr w14:val="accent2"/>
+                  </w14:solidFill>
+                </w14:textFill>
+              </w:rPr>
+            </w:pPr>
+          </w:p>
+        </w:tc>
+        <w:tc>
+          <w:tcPr>
+            <w:tcW w:w="4394" w:type="dxa"/>
+          </w:tcPr>
+          <w:p>
+            <w:pPr>
+              <w:rPr>
+                <w:rFonts w:hint="eastAsia"/>
+                <w:color w:val="ED7D31" w:themeColor="accent2"/>
+                <w:kern w:val="0"/>
+                <w:sz w:val="21"/>
+                <w:szCs w:val="21"/>
+                <w14:textFill>
+                  <w14:solidFill>
+                    <w14:schemeClr w14:val="accent2"/>
+                  </w14:solidFill>
+                </w14:textFill>
+              </w:rPr>
+            </w:pPr>
+            <w:r>
+              <w:rPr>
+                <w:rFonts w:hint="eastAsia"/>
+                <w:color w:val="ED7D31" w:themeColor="accent2"/>
+                <w:kern w:val="0"/>
+                <w:sz w:val="21"/>
+                <w:szCs w:val="21"/>
+                <w14:textFill>
+                  <w14:solidFill>
+                    <w14:schemeClr w14:val="accent2"/>
+                  </w14:solidFill>
+                </w14:textFill>
+              </w:rPr>
+              <w:t>向上位机发送镜头类型</w:t>
+            </w:r>
+          </w:p>
+        </w:tc>
+      </w:tr>
+      <w:tr>
+        <w:tblPrEx>
+          <w:tblBorders>
+            <w:top w:val="single" w:color="auto" w:sz="4" w:space="0"/>
+            <w:left w:val="single" w:color="auto" w:sz="4" w:space="0"/>
+            <w:bottom w:val="single" w:color="auto" w:sz="4" w:space="0"/>
+            <w:right w:val="single" w:color="auto" w:sz="4" w:space="0"/>
+            <w:insideH w:val="single" w:color="auto" w:sz="4" w:space="0"/>
+            <w:insideV w:val="single" w:color="auto" w:sz="4" w:space="0"/>
+          </w:tblBorders>
+          <w:tblCellMar>
+            <w:top w:w="0" w:type="dxa"/>
+            <w:left w:w="108" w:type="dxa"/>
+            <w:bottom w:w="0" w:type="dxa"/>
+            <w:right w:w="108" w:type="dxa"/>
+          </w:tblCellMar>
+        </w:tblPrEx>
+        <w:tc>
+          <w:tcPr>
+            <w:tcW w:w="993" w:type="dxa"/>
+            <w:vMerge w:val="continue"/>
+          </w:tcPr>
+          <w:p>
+            <w:pPr>
+              <w:rPr>
+                <w:rFonts w:hint="eastAsia"/>
+                <w:kern w:val="0"/>
+                <w:sz w:val="20"/>
+                <w:szCs w:val="21"/>
+              </w:rPr>
+            </w:pPr>
+          </w:p>
+        </w:tc>
+        <w:tc>
+          <w:tcPr>
+            <w:tcW w:w="708" w:type="dxa"/>
+          </w:tcPr>
+          <w:p>
+            <w:pPr>
+              <w:jc w:val="center"/>
+              <w:rPr>
+                <w:rFonts w:hint="eastAsia"/>
+                <w:kern w:val="0"/>
+                <w:sz w:val="20"/>
+                <w:szCs w:val="21"/>
+              </w:rPr>
+            </w:pPr>
+            <w:r>
+              <w:rPr>
+                <w:rFonts w:hint="eastAsia"/>
+                <w:kern w:val="0"/>
+                <w:sz w:val="21"/>
+                <w:szCs w:val="21"/>
+              </w:rPr>
+              <w:t>0x</w:t>
+            </w:r>
+            <w:r>
+              <w:rPr>
+                <w:kern w:val="0"/>
+                <w:sz w:val="21"/>
+                <w:szCs w:val="21"/>
+              </w:rPr>
+              <w:t>14</w:t>
+            </w:r>
+          </w:p>
+        </w:tc>
+        <w:tc>
+          <w:tcPr>
+            <w:tcW w:w="1702" w:type="dxa"/>
+          </w:tcPr>
+          <w:p>
+            <w:pPr>
+              <w:jc w:val="center"/>
+              <w:rPr>
+                <w:rFonts w:hint="eastAsia"/>
+                <w:kern w:val="0"/>
+                <w:sz w:val="20"/>
+                <w:szCs w:val="21"/>
+              </w:rPr>
+            </w:pPr>
+            <w:r>
+              <w:rPr>
+                <w:rFonts w:hint="eastAsia"/>
+                <w:kern w:val="0"/>
+                <w:sz w:val="20"/>
+                <w:szCs w:val="21"/>
+              </w:rPr>
+              <w:t>最小</w:t>
+            </w:r>
+            <w:r>
+              <w:rPr>
+                <w:kern w:val="0"/>
+                <w:sz w:val="20"/>
+                <w:szCs w:val="21"/>
+              </w:rPr>
+              <w:t>倍率</w:t>
+            </w:r>
+          </w:p>
+        </w:tc>
+        <w:tc>
+          <w:tcPr>
+            <w:tcW w:w="850" w:type="dxa"/>
+            <w:vMerge w:val="continue"/>
+            <w:vAlign w:val="center"/>
+          </w:tcPr>
+          <w:p>
+            <w:pPr>
+              <w:jc w:val="center"/>
+              <w:rPr>
+                <w:rFonts w:hint="eastAsia"/>
+                <w:color w:val="ED7D31" w:themeColor="accent2"/>
+                <w:kern w:val="0"/>
+                <w:sz w:val="20"/>
+                <w:szCs w:val="21"/>
+                <w14:textFill>
+                  <w14:solidFill>
+                    <w14:schemeClr w14:val="accent2"/>
+                  </w14:solidFill>
+                </w14:textFill>
+              </w:rPr>
+            </w:pPr>
+          </w:p>
+        </w:tc>
+        <w:tc>
+          <w:tcPr>
+            <w:tcW w:w="4394" w:type="dxa"/>
+          </w:tcPr>
+          <w:p>
+            <w:pPr>
+              <w:rPr>
+                <w:rFonts w:hint="eastAsia"/>
+                <w:color w:val="ED7D31" w:themeColor="accent2"/>
+                <w:kern w:val="0"/>
+                <w:sz w:val="20"/>
+                <w:szCs w:val="21"/>
+                <w14:textFill>
+                  <w14:solidFill>
+                    <w14:schemeClr w14:val="accent2"/>
+                  </w14:solidFill>
+                </w14:textFill>
+              </w:rPr>
+            </w:pPr>
+            <w:r>
+              <w:rPr>
+                <w:rFonts w:hint="eastAsia"/>
+                <w:kern w:val="0"/>
+                <w:sz w:val="21"/>
+                <w:szCs w:val="21"/>
+              </w:rPr>
+              <w:t>向上位机发送镜头最小倍率</w:t>
+            </w:r>
+          </w:p>
+        </w:tc>
+      </w:tr>
+      <w:tr>
+        <w:tblPrEx>
+          <w:tblBorders>
+            <w:top w:val="single" w:color="auto" w:sz="4" w:space="0"/>
+            <w:left w:val="single" w:color="auto" w:sz="4" w:space="0"/>
+            <w:bottom w:val="single" w:color="auto" w:sz="4" w:space="0"/>
+            <w:right w:val="single" w:color="auto" w:sz="4" w:space="0"/>
+            <w:insideH w:val="single" w:color="auto" w:sz="4" w:space="0"/>
+            <w:insideV w:val="single" w:color="auto" w:sz="4" w:space="0"/>
+          </w:tblBorders>
+          <w:tblCellMar>
+            <w:top w:w="0" w:type="dxa"/>
+            <w:left w:w="108" w:type="dxa"/>
+            <w:bottom w:w="0" w:type="dxa"/>
+            <w:right w:w="108" w:type="dxa"/>
+          </w:tblCellMar>
+        </w:tblPrEx>
+        <w:tc>
+          <w:tcPr>
+            <w:tcW w:w="993" w:type="dxa"/>
+            <w:vMerge w:val="continue"/>
+          </w:tcPr>
+          <w:p>
+            <w:pPr>
+              <w:rPr>
+                <w:rFonts w:hint="eastAsia"/>
+                <w:kern w:val="0"/>
+                <w:sz w:val="20"/>
+                <w:szCs w:val="21"/>
+              </w:rPr>
+            </w:pPr>
+          </w:p>
+        </w:tc>
+        <w:tc>
+          <w:tcPr>
+            <w:tcW w:w="708" w:type="dxa"/>
+          </w:tcPr>
+          <w:p>
+            <w:pPr>
+              <w:jc w:val="center"/>
+              <w:rPr>
+                <w:rFonts w:hint="eastAsia"/>
+                <w:kern w:val="0"/>
+                <w:sz w:val="20"/>
+                <w:szCs w:val="21"/>
+              </w:rPr>
+            </w:pPr>
+            <w:r>
+              <w:rPr>
+                <w:rFonts w:hint="eastAsia"/>
+                <w:kern w:val="0"/>
+                <w:sz w:val="21"/>
+                <w:szCs w:val="21"/>
+              </w:rPr>
+              <w:t>0x</w:t>
+            </w:r>
+            <w:r>
+              <w:rPr>
+                <w:kern w:val="0"/>
+                <w:sz w:val="21"/>
+                <w:szCs w:val="21"/>
+              </w:rPr>
+              <w:t>15</w:t>
+            </w:r>
+          </w:p>
+        </w:tc>
+        <w:tc>
+          <w:tcPr>
+            <w:tcW w:w="1702" w:type="dxa"/>
+          </w:tcPr>
+          <w:p>
+            <w:pPr>
+              <w:jc w:val="center"/>
+              <w:rPr>
+                <w:rFonts w:hint="eastAsia"/>
+                <w:kern w:val="0"/>
+                <w:sz w:val="20"/>
+                <w:szCs w:val="21"/>
+              </w:rPr>
+            </w:pPr>
+            <w:r>
+              <w:rPr>
+                <w:rFonts w:hint="eastAsia"/>
+                <w:kern w:val="0"/>
+                <w:sz w:val="20"/>
+                <w:szCs w:val="21"/>
+              </w:rPr>
+              <w:t>最大</w:t>
+            </w:r>
+            <w:r>
+              <w:rPr>
+                <w:kern w:val="0"/>
+                <w:sz w:val="20"/>
+                <w:szCs w:val="21"/>
+              </w:rPr>
+              <w:t>倍率</w:t>
+            </w:r>
+          </w:p>
+        </w:tc>
+        <w:tc>
+          <w:tcPr>
+            <w:tcW w:w="850" w:type="dxa"/>
+            <w:vMerge w:val="continue"/>
+            <w:vAlign w:val="center"/>
+          </w:tcPr>
+          <w:p>
+            <w:pPr>
+              <w:jc w:val="center"/>
+              <w:rPr>
+                <w:rFonts w:hint="eastAsia"/>
+                <w:color w:val="ED7D31" w:themeColor="accent2"/>
+                <w:kern w:val="0"/>
+                <w:sz w:val="20"/>
+                <w:szCs w:val="21"/>
+                <w14:textFill>
+                  <w14:solidFill>
+                    <w14:schemeClr w14:val="accent2"/>
+                  </w14:solidFill>
+                </w14:textFill>
+              </w:rPr>
+            </w:pPr>
+          </w:p>
+        </w:tc>
+        <w:tc>
+          <w:tcPr>
+            <w:tcW w:w="4394" w:type="dxa"/>
+          </w:tcPr>
+          <w:p>
+            <w:pPr>
+              <w:rPr>
+                <w:rFonts w:hint="eastAsia"/>
+                <w:color w:val="ED7D31" w:themeColor="accent2"/>
+                <w:kern w:val="0"/>
+                <w:sz w:val="20"/>
+                <w:szCs w:val="21"/>
+                <w14:textFill>
+                  <w14:solidFill>
+                    <w14:schemeClr w14:val="accent2"/>
+                  </w14:solidFill>
+                </w14:textFill>
+              </w:rPr>
+            </w:pPr>
+            <w:r>
+              <w:rPr>
+                <w:rFonts w:hint="eastAsia"/>
+                <w:kern w:val="0"/>
+                <w:sz w:val="21"/>
+                <w:szCs w:val="21"/>
+              </w:rPr>
+              <w:t>向上位机发送镜头最大倍率</w:t>
             </w:r>
           </w:p>
         </w:tc>
@@ -9466,7 +11222,7 @@
               <w:rPr>
                 <w:rFonts w:hint="eastAsia"/>
                 <w:kern w:val="0"/>
-                <w:sz w:val="21"/>
+                <w:sz w:val="20"/>
                 <w:szCs w:val="21"/>
               </w:rPr>
             </w:pPr>
@@ -9481,30 +11237,36 @@
               <w:jc w:val="center"/>
               <w:rPr>
                 <w:rFonts w:hint="eastAsia"/>
-                <w:color w:val="EE0000"/>
-                <w:kern w:val="0"/>
-                <w:sz w:val="21"/>
-                <w:szCs w:val="21"/>
-              </w:rPr>
-            </w:pPr>
-            <w:r>
-              <w:rPr>
-                <w:rFonts w:hint="eastAsia"/>
-                <w:color w:val="EE0000"/>
-                <w:kern w:val="0"/>
-                <w:sz w:val="21"/>
-                <w:szCs w:val="21"/>
-              </w:rPr>
-              <w:t>0</w:t>
-            </w:r>
-            <w:r>
-              <w:rPr>
-                <w:color w:val="EE0000"/>
-                <w:kern w:val="0"/>
-                <w:sz w:val="21"/>
-                <w:szCs w:val="21"/>
-              </w:rPr>
-              <w:t>x03</w:t>
+                <w:kern w:val="0"/>
+                <w:sz w:val="20"/>
+                <w:szCs w:val="21"/>
+              </w:rPr>
+            </w:pPr>
+            <w:r>
+              <w:rPr>
+                <w:rFonts w:hint="eastAsia"/>
+                <w:kern w:val="0"/>
+                <w:sz w:val="21"/>
+                <w:szCs w:val="21"/>
+              </w:rPr>
+              <w:t>0x</w:t>
+            </w:r>
+            <w:r>
+              <w:rPr>
+                <w:kern w:val="0"/>
+                <w:sz w:val="21"/>
+                <w:szCs w:val="21"/>
+              </w:rPr>
+              <w:t>1</w:t>
+            </w:r>
+            <w:r>
+              <w:rPr>
+                <w:rFonts w:hint="eastAsia"/>
+                <w:kern w:val="0"/>
+                <w:sz w:val="21"/>
+                <w:szCs w:val="21"/>
+              </w:rPr>
+              <w:t>6</w:t>
             </w:r>
           </w:p>
         </w:tc>
@@ -9517,21 +11279,19 @@
               <w:jc w:val="center"/>
               <w:rPr>
                 <w:rFonts w:hint="eastAsia"/>
-                <w:color w:val="EE0000"/>
-                <w:kern w:val="0"/>
-                <w:sz w:val="21"/>
-                <w:szCs w:val="21"/>
-              </w:rPr>
-            </w:pPr>
-            <w:r>
-              <w:rPr>
-                <w:rFonts w:hint="eastAsia"/>
-                <w:color w:val="EE0000"/>
-                <w:kern w:val="0"/>
-                <w:sz w:val="21"/>
-                <w:szCs w:val="21"/>
-              </w:rPr>
-              <w:t>0x000E</w:t>
+                <w:kern w:val="0"/>
+                <w:sz w:val="20"/>
+                <w:szCs w:val="21"/>
+              </w:rPr>
+            </w:pPr>
+            <w:r>
+              <w:rPr>
+                <w:rFonts w:hint="eastAsia"/>
+                <w:kern w:val="0"/>
+                <w:sz w:val="20"/>
+                <w:szCs w:val="21"/>
+              </w:rPr>
+              <w:t>版本信息</w:t>
             </w:r>
           </w:p>
         </w:tc>
@@ -9539,15 +11299,22 @@
           <w:tcPr>
             <w:tcW w:w="850" w:type="dxa"/>
             <w:vMerge w:val="continue"/>
-          </w:tcPr>
-          <w:p>
-            <w:pPr>
-              <w:jc w:val="center"/>
-              <w:rPr>
-                <w:rFonts w:hint="eastAsia"/>
-                <w:kern w:val="0"/>
-                <w:sz w:val="21"/>
-                <w:szCs w:val="21"/>
+            <w:vAlign w:val="center"/>
+          </w:tcPr>
+          <w:p>
+            <w:pPr>
+              <w:jc w:val="center"/>
+              <w:rPr>
+                <w:rFonts w:hint="eastAsia"/>
+                <w:color w:val="ED7D31" w:themeColor="accent2"/>
+                <w:kern w:val="0"/>
+                <w:sz w:val="20"/>
+                <w:szCs w:val="21"/>
+                <w14:textFill>
+                  <w14:solidFill>
+                    <w14:schemeClr w14:val="accent2"/>
+                  </w14:solidFill>
+                </w14:textFill>
               </w:rPr>
             </w:pPr>
           </w:p>
@@ -9560,64 +11327,364 @@
             <w:pPr>
               <w:rPr>
                 <w:rFonts w:hint="eastAsia"/>
-                <w:color w:val="EE0000"/>
-                <w:kern w:val="0"/>
-                <w:sz w:val="21"/>
-                <w:szCs w:val="21"/>
-              </w:rPr>
-            </w:pPr>
-            <w:r>
-              <w:rPr>
-                <w:rFonts w:hint="eastAsia"/>
-                <w:color w:val="EE0000"/>
-                <w:kern w:val="0"/>
-                <w:sz w:val="21"/>
-                <w:szCs w:val="21"/>
-              </w:rPr>
-              <w:t>镜头</w:t>
-            </w:r>
-            <w:r>
-              <w:rPr>
-                <w:color w:val="EE0000"/>
-                <w:kern w:val="0"/>
-                <w:sz w:val="21"/>
-                <w:szCs w:val="21"/>
-              </w:rPr>
-              <w:t>变倍中，请求</w:t>
-            </w:r>
-            <w:r>
-              <w:rPr>
-                <w:rFonts w:hint="eastAsia"/>
-                <w:color w:val="EE0000"/>
-                <w:kern w:val="0"/>
-                <w:sz w:val="21"/>
-                <w:szCs w:val="21"/>
-              </w:rPr>
-              <w:t xml:space="preserve">无效 </w:t>
-            </w:r>
-            <w:r>
-              <w:rPr>
-                <w:rFonts w:hint="eastAsia"/>
-                <w:color w:val="EE0000"/>
-                <w:kern w:val="0"/>
-                <w:sz w:val="21"/>
-                <w:szCs w:val="21"/>
-                <w:vertAlign w:val="superscript"/>
-              </w:rPr>
-              <w:t>*</w:t>
-            </w:r>
-            <w:r>
-              <w:rPr>
-                <w:rFonts w:hint="eastAsia"/>
-                <w:b/>
-                <w:bCs/>
-                <w:color w:val="EE0000"/>
-                <w:kern w:val="0"/>
-                <w:sz w:val="21"/>
-                <w:szCs w:val="21"/>
-                <w:vertAlign w:val="superscript"/>
-              </w:rPr>
-              <w:t>1</w:t>
+                <w:kern w:val="0"/>
+                <w:sz w:val="20"/>
+                <w:szCs w:val="21"/>
+              </w:rPr>
+            </w:pPr>
+            <w:r>
+              <w:rPr>
+                <w:rFonts w:hint="eastAsia"/>
+                <w:color w:val="ED7D31" w:themeColor="accent2"/>
+                <w:kern w:val="0"/>
+                <w:sz w:val="21"/>
+                <w:szCs w:val="21"/>
+                <w14:textFill>
+                  <w14:solidFill>
+                    <w14:schemeClr w14:val="accent2"/>
+                  </w14:solidFill>
+                </w14:textFill>
+              </w:rPr>
+              <w:t>向上位机发送镜头固件版本信息</w:t>
+            </w:r>
+          </w:p>
+        </w:tc>
+      </w:tr>
+      <w:tr>
+        <w:tblPrEx>
+          <w:tblBorders>
+            <w:top w:val="single" w:color="auto" w:sz="4" w:space="0"/>
+            <w:left w:val="single" w:color="auto" w:sz="4" w:space="0"/>
+            <w:bottom w:val="single" w:color="auto" w:sz="4" w:space="0"/>
+            <w:right w:val="single" w:color="auto" w:sz="4" w:space="0"/>
+            <w:insideH w:val="single" w:color="auto" w:sz="4" w:space="0"/>
+            <w:insideV w:val="single" w:color="auto" w:sz="4" w:space="0"/>
+          </w:tblBorders>
+          <w:tblCellMar>
+            <w:top w:w="0" w:type="dxa"/>
+            <w:left w:w="108" w:type="dxa"/>
+            <w:bottom w:w="0" w:type="dxa"/>
+            <w:right w:w="108" w:type="dxa"/>
+          </w:tblCellMar>
+        </w:tblPrEx>
+        <w:tc>
+          <w:tcPr>
+            <w:tcW w:w="993" w:type="dxa"/>
+            <w:vMerge w:val="continue"/>
+          </w:tcPr>
+          <w:p>
+            <w:pPr>
+              <w:rPr>
+                <w:rFonts w:hint="eastAsia"/>
+                <w:kern w:val="0"/>
+                <w:sz w:val="20"/>
+                <w:szCs w:val="21"/>
+              </w:rPr>
+            </w:pPr>
+          </w:p>
+        </w:tc>
+        <w:tc>
+          <w:tcPr>
+            <w:tcW w:w="7654" w:type="dxa"/>
+            <w:gridSpan w:val="4"/>
+          </w:tcPr>
+          <w:p>
+            <w:pPr>
+              <w:rPr>
+                <w:rFonts w:hint="eastAsia"/>
+                <w:kern w:val="0"/>
+                <w:sz w:val="20"/>
+                <w:szCs w:val="21"/>
+              </w:rPr>
+            </w:pPr>
+          </w:p>
+        </w:tc>
+      </w:tr>
+      <w:tr>
+        <w:tblPrEx>
+          <w:tblBorders>
+            <w:top w:val="single" w:color="auto" w:sz="4" w:space="0"/>
+            <w:left w:val="single" w:color="auto" w:sz="4" w:space="0"/>
+            <w:bottom w:val="single" w:color="auto" w:sz="4" w:space="0"/>
+            <w:right w:val="single" w:color="auto" w:sz="4" w:space="0"/>
+            <w:insideH w:val="single" w:color="auto" w:sz="4" w:space="0"/>
+            <w:insideV w:val="single" w:color="auto" w:sz="4" w:space="0"/>
+          </w:tblBorders>
+          <w:tblCellMar>
+            <w:top w:w="0" w:type="dxa"/>
+            <w:left w:w="108" w:type="dxa"/>
+            <w:bottom w:w="0" w:type="dxa"/>
+            <w:right w:w="108" w:type="dxa"/>
+          </w:tblCellMar>
+        </w:tblPrEx>
+        <w:tc>
+          <w:tcPr>
+            <w:tcW w:w="993" w:type="dxa"/>
+            <w:vMerge w:val="continue"/>
+          </w:tcPr>
+          <w:p>
+            <w:pPr>
+              <w:rPr>
+                <w:rFonts w:hint="eastAsia"/>
+                <w:kern w:val="0"/>
+                <w:sz w:val="20"/>
+                <w:szCs w:val="21"/>
+              </w:rPr>
+            </w:pPr>
+          </w:p>
+        </w:tc>
+        <w:tc>
+          <w:tcPr>
+            <w:tcW w:w="708" w:type="dxa"/>
+            <w:vAlign w:val="center"/>
+          </w:tcPr>
+          <w:p>
+            <w:pPr>
+              <w:jc w:val="center"/>
+              <w:rPr>
+                <w:rFonts w:hint="eastAsia"/>
+                <w:kern w:val="0"/>
+                <w:sz w:val="21"/>
+                <w:szCs w:val="21"/>
+              </w:rPr>
+            </w:pPr>
+            <w:r>
+              <w:rPr>
+                <w:rFonts w:hint="eastAsia"/>
+                <w:kern w:val="0"/>
+                <w:sz w:val="21"/>
+                <w:szCs w:val="21"/>
+              </w:rPr>
+              <w:t>0x</w:t>
+            </w:r>
+            <w:r>
+              <w:rPr>
+                <w:kern w:val="0"/>
+                <w:sz w:val="21"/>
+                <w:szCs w:val="21"/>
+              </w:rPr>
+              <w:t>E0</w:t>
+            </w:r>
+          </w:p>
+        </w:tc>
+        <w:tc>
+          <w:tcPr>
+            <w:tcW w:w="1702" w:type="dxa"/>
+          </w:tcPr>
+          <w:p>
+            <w:pPr>
+              <w:jc w:val="center"/>
+              <w:rPr>
+                <w:rFonts w:hint="eastAsia"/>
+                <w:i/>
+                <w:kern w:val="0"/>
+                <w:sz w:val="21"/>
+                <w:szCs w:val="21"/>
+              </w:rPr>
+            </w:pPr>
+            <w:r>
+              <w:rPr>
+                <w:rFonts w:hint="eastAsia"/>
+                <w:i/>
+                <w:kern w:val="0"/>
+                <w:sz w:val="21"/>
+                <w:szCs w:val="21"/>
+              </w:rPr>
+              <w:t>保留字节</w:t>
+            </w:r>
+          </w:p>
+        </w:tc>
+        <w:tc>
+          <w:tcPr>
+            <w:tcW w:w="850" w:type="dxa"/>
+            <w:vMerge w:val="restart"/>
+            <w:vAlign w:val="center"/>
+          </w:tcPr>
+          <w:p>
+            <w:pPr>
+              <w:jc w:val="center"/>
+              <w:rPr>
+                <w:rFonts w:hint="eastAsia"/>
+                <w:kern w:val="0"/>
+                <w:sz w:val="21"/>
+                <w:szCs w:val="21"/>
+              </w:rPr>
+            </w:pPr>
+            <w:r>
+              <w:rPr>
+                <w:rFonts w:hint="eastAsia"/>
+                <w:kern w:val="0"/>
+                <w:sz w:val="21"/>
+                <w:szCs w:val="21"/>
+              </w:rPr>
+              <w:t>CRC16</w:t>
+            </w:r>
+          </w:p>
+        </w:tc>
+        <w:tc>
+          <w:tcPr>
+            <w:tcW w:w="4394" w:type="dxa"/>
+          </w:tcPr>
+          <w:p>
+            <w:pPr>
+              <w:rPr>
+                <w:rFonts w:hint="eastAsia"/>
+                <w:kern w:val="0"/>
+                <w:sz w:val="21"/>
+                <w:szCs w:val="21"/>
+              </w:rPr>
+            </w:pPr>
+            <w:r>
+              <w:rPr>
+                <w:rFonts w:hint="eastAsia"/>
+                <w:kern w:val="0"/>
+                <w:sz w:val="21"/>
+                <w:szCs w:val="21"/>
+              </w:rPr>
+              <w:t>命令</w:t>
+            </w:r>
+            <w:r>
+              <w:rPr>
+                <w:kern w:val="0"/>
+                <w:sz w:val="21"/>
+                <w:szCs w:val="21"/>
+              </w:rPr>
+              <w:t>参数错误</w:t>
+            </w:r>
+          </w:p>
+        </w:tc>
+      </w:tr>
+      <w:tr>
+        <w:tblPrEx>
+          <w:tblBorders>
+            <w:top w:val="single" w:color="auto" w:sz="4" w:space="0"/>
+            <w:left w:val="single" w:color="auto" w:sz="4" w:space="0"/>
+            <w:bottom w:val="single" w:color="auto" w:sz="4" w:space="0"/>
+            <w:right w:val="single" w:color="auto" w:sz="4" w:space="0"/>
+            <w:insideH w:val="single" w:color="auto" w:sz="4" w:space="0"/>
+            <w:insideV w:val="single" w:color="auto" w:sz="4" w:space="0"/>
+          </w:tblBorders>
+          <w:tblCellMar>
+            <w:top w:w="0" w:type="dxa"/>
+            <w:left w:w="108" w:type="dxa"/>
+            <w:bottom w:w="0" w:type="dxa"/>
+            <w:right w:w="108" w:type="dxa"/>
+          </w:tblCellMar>
+        </w:tblPrEx>
+        <w:tc>
+          <w:tcPr>
+            <w:tcW w:w="993" w:type="dxa"/>
+            <w:vMerge w:val="continue"/>
+          </w:tcPr>
+          <w:p>
+            <w:pPr>
+              <w:rPr>
+                <w:rFonts w:hint="eastAsia"/>
+                <w:kern w:val="0"/>
+                <w:sz w:val="20"/>
+                <w:szCs w:val="21"/>
+              </w:rPr>
+            </w:pPr>
+          </w:p>
+        </w:tc>
+        <w:tc>
+          <w:tcPr>
+            <w:tcW w:w="708" w:type="dxa"/>
+          </w:tcPr>
+          <w:p>
+            <w:pPr>
+              <w:jc w:val="center"/>
+              <w:rPr>
+                <w:rFonts w:hint="eastAsia"/>
+                <w:kern w:val="0"/>
+                <w:sz w:val="21"/>
+                <w:szCs w:val="21"/>
+              </w:rPr>
+            </w:pPr>
+            <w:r>
+              <w:rPr>
+                <w:rFonts w:hint="eastAsia"/>
+                <w:kern w:val="0"/>
+                <w:sz w:val="21"/>
+                <w:szCs w:val="21"/>
+              </w:rPr>
+              <w:t>0x</w:t>
+            </w:r>
+            <w:r>
+              <w:rPr>
+                <w:kern w:val="0"/>
+                <w:sz w:val="21"/>
+                <w:szCs w:val="21"/>
+              </w:rPr>
+              <w:t>E1</w:t>
+            </w:r>
+          </w:p>
+        </w:tc>
+        <w:tc>
+          <w:tcPr>
+            <w:tcW w:w="1702" w:type="dxa"/>
+          </w:tcPr>
+          <w:p>
+            <w:pPr>
+              <w:jc w:val="center"/>
+              <w:rPr>
+                <w:rFonts w:hint="eastAsia"/>
+                <w:i/>
+                <w:kern w:val="0"/>
+                <w:sz w:val="21"/>
+                <w:szCs w:val="21"/>
+              </w:rPr>
+            </w:pPr>
+            <w:r>
+              <w:rPr>
+                <w:rFonts w:hint="eastAsia"/>
+                <w:i/>
+                <w:kern w:val="0"/>
+                <w:sz w:val="21"/>
+                <w:szCs w:val="21"/>
+              </w:rPr>
+              <w:t>保留字节</w:t>
+            </w:r>
+          </w:p>
+        </w:tc>
+        <w:tc>
+          <w:tcPr>
+            <w:tcW w:w="850" w:type="dxa"/>
+            <w:vMerge w:val="continue"/>
+          </w:tcPr>
+          <w:p>
+            <w:pPr>
+              <w:jc w:val="center"/>
+              <w:rPr>
+                <w:rFonts w:hint="eastAsia"/>
+                <w:kern w:val="0"/>
+                <w:sz w:val="21"/>
+                <w:szCs w:val="21"/>
+              </w:rPr>
+            </w:pPr>
+          </w:p>
+        </w:tc>
+        <w:tc>
+          <w:tcPr>
+            <w:tcW w:w="4394" w:type="dxa"/>
+          </w:tcPr>
+          <w:p>
+            <w:pPr>
+              <w:rPr>
+                <w:rFonts w:hint="eastAsia"/>
+                <w:kern w:val="0"/>
+                <w:sz w:val="21"/>
+                <w:szCs w:val="21"/>
+              </w:rPr>
+            </w:pPr>
+            <w:r>
+              <w:rPr>
+                <w:rFonts w:hint="eastAsia"/>
+                <w:kern w:val="0"/>
+                <w:sz w:val="21"/>
+                <w:szCs w:val="21"/>
+              </w:rPr>
+              <w:t>多次堵转，停止变倍</w:t>
             </w:r>
           </w:p>
         </w:tc>
@@ -9658,30 +11725,27 @@
               <w:jc w:val="center"/>
               <w:rPr>
                 <w:rFonts w:hint="eastAsia"/>
-                <w:color w:val="C55A11" w:themeColor="accent2" w:themeShade="BF"/>
-                <w:kern w:val="0"/>
-                <w:sz w:val="20"/>
-                <w:szCs w:val="21"/>
-              </w:rPr>
-            </w:pPr>
-            <w:r>
-              <w:rPr>
-                <w:rFonts w:hint="eastAsia"/>
-                <w:color w:val="C55A11" w:themeColor="accent2" w:themeShade="BF"/>
-                <w:kern w:val="0"/>
-                <w:sz w:val="20"/>
+                <w:kern w:val="0"/>
+                <w:sz w:val="21"/>
+                <w:szCs w:val="21"/>
+              </w:rPr>
+            </w:pPr>
+            <w:r>
+              <w:rPr>
+                <w:rFonts w:hint="eastAsia"/>
+                <w:kern w:val="0"/>
+                <w:sz w:val="21"/>
                 <w:szCs w:val="21"/>
               </w:rPr>
               <w:t>0x</w:t>
             </w:r>
             <w:r>
               <w:rPr>
-                <w:color w:val="C55A11" w:themeColor="accent2" w:themeShade="BF"/>
-                <w:kern w:val="0"/>
-                <w:sz w:val="20"/>
-                <w:szCs w:val="21"/>
-              </w:rPr>
-              <w:t>04</w:t>
+                <w:kern w:val="0"/>
+                <w:sz w:val="21"/>
+                <w:szCs w:val="21"/>
+              </w:rPr>
+              <w:t>E2</w:t>
             </w:r>
           </w:p>
         </w:tc>
@@ -9694,30 +11758,21 @@
               <w:jc w:val="center"/>
               <w:rPr>
                 <w:rFonts w:hint="eastAsia"/>
-                <w:color w:val="C55A11" w:themeColor="accent2" w:themeShade="BF"/>
-                <w:kern w:val="0"/>
-                <w:sz w:val="20"/>
-                <w:szCs w:val="21"/>
-              </w:rPr>
-            </w:pPr>
-            <w:r>
-              <w:rPr>
-                <w:rFonts w:hint="eastAsia"/>
-                <w:color w:val="C55A11" w:themeColor="accent2" w:themeShade="BF"/>
-                <w:kern w:val="0"/>
-                <w:sz w:val="21"/>
-                <w:szCs w:val="21"/>
-              </w:rPr>
-              <w:t>0x00</w:t>
-            </w:r>
-            <w:r>
-              <w:rPr>
-                <w:color w:val="C55A11" w:themeColor="accent2" w:themeShade="BF"/>
-                <w:kern w:val="0"/>
-                <w:sz w:val="21"/>
-                <w:szCs w:val="21"/>
-              </w:rPr>
-              <w:t>0D</w:t>
+                <w:i/>
+                <w:kern w:val="0"/>
+                <w:sz w:val="21"/>
+                <w:szCs w:val="21"/>
+              </w:rPr>
+            </w:pPr>
+            <w:r>
+              <w:rPr>
+                <w:rFonts w:hint="eastAsia"/>
+                <w:i/>
+                <w:kern w:val="0"/>
+                <w:sz w:val="21"/>
+                <w:szCs w:val="21"/>
+              </w:rPr>
+              <w:t>保留字节</w:t>
             </w:r>
           </w:p>
         </w:tc>
@@ -9731,9 +11786,8 @@
               <w:jc w:val="center"/>
               <w:rPr>
                 <w:rFonts w:hint="eastAsia"/>
-                <w:color w:val="C55A11" w:themeColor="accent2" w:themeShade="BF"/>
-                <w:kern w:val="0"/>
-                <w:sz w:val="20"/>
+                <w:kern w:val="0"/>
+                <w:sz w:val="21"/>
                 <w:szCs w:val="21"/>
               </w:rPr>
             </w:pPr>
@@ -9747,40 +11801,19 @@
             <w:pPr>
               <w:rPr>
                 <w:rFonts w:hint="eastAsia"/>
-                <w:color w:val="C55A11" w:themeColor="accent2" w:themeShade="BF"/>
-                <w:kern w:val="0"/>
-                <w:sz w:val="20"/>
-                <w:szCs w:val="21"/>
-              </w:rPr>
-            </w:pPr>
-            <w:r>
-              <w:rPr>
-                <w:rFonts w:hint="eastAsia"/>
-                <w:color w:val="C55A11" w:themeColor="accent2" w:themeShade="BF"/>
-                <w:kern w:val="0"/>
-                <w:sz w:val="20"/>
-                <w:szCs w:val="21"/>
-              </w:rPr>
-              <w:t>超声波</w:t>
-            </w:r>
-            <w:r>
-              <w:rPr>
-                <w:color w:val="C55A11" w:themeColor="accent2" w:themeShade="BF"/>
-                <w:kern w:val="0"/>
-                <w:sz w:val="20"/>
-                <w:szCs w:val="21"/>
-              </w:rPr>
-              <w:t>电机</w:t>
-            </w:r>
-            <w:r>
-              <w:rPr>
-                <w:rFonts w:hint="eastAsia"/>
-                <w:color w:val="C55A11" w:themeColor="accent2" w:themeShade="BF"/>
-                <w:kern w:val="0"/>
-                <w:sz w:val="20"/>
-                <w:szCs w:val="21"/>
-              </w:rPr>
-              <w:t>扫描完成</w:t>
+                <w:kern w:val="0"/>
+                <w:sz w:val="21"/>
+                <w:szCs w:val="21"/>
+              </w:rPr>
+            </w:pPr>
+            <w:r>
+              <w:rPr>
+                <w:rFonts w:hint="eastAsia"/>
+                <w:kern w:val="0"/>
+                <w:sz w:val="21"/>
+                <w:szCs w:val="21"/>
+              </w:rPr>
+              <w:t>过流</w:t>
             </w:r>
           </w:p>
         </w:tc>
@@ -9795,1937 +11828,12 @@
             <w:insideH w:val="single" w:color="auto" w:sz="4" w:space="0"/>
             <w:insideV w:val="single" w:color="auto" w:sz="4" w:space="0"/>
           </w:tblBorders>
-        </w:tblPrEx>
-        <w:tc>
-          <w:tcPr>
-            <w:tcW w:w="993" w:type="dxa"/>
-            <w:vMerge w:val="continue"/>
-          </w:tcPr>
-          <w:p>
-            <w:pPr>
-              <w:rPr>
-                <w:rFonts w:hint="eastAsia"/>
-                <w:kern w:val="0"/>
-                <w:sz w:val="20"/>
-                <w:szCs w:val="21"/>
-              </w:rPr>
-            </w:pPr>
-          </w:p>
-        </w:tc>
-        <w:tc>
-          <w:tcPr>
-            <w:tcW w:w="708" w:type="dxa"/>
-          </w:tcPr>
-          <w:p>
-            <w:pPr>
-              <w:jc w:val="center"/>
-              <w:rPr>
-                <w:rFonts w:hint="eastAsia"/>
-                <w:color w:val="C55A11" w:themeColor="accent2" w:themeShade="BF"/>
-                <w:kern w:val="0"/>
-                <w:sz w:val="20"/>
-                <w:szCs w:val="21"/>
-              </w:rPr>
-            </w:pPr>
-            <w:r>
-              <w:rPr>
-                <w:rFonts w:hint="eastAsia"/>
-                <w:color w:val="C55A11" w:themeColor="accent2" w:themeShade="BF"/>
-                <w:kern w:val="0"/>
-                <w:sz w:val="20"/>
-                <w:szCs w:val="21"/>
-              </w:rPr>
-              <w:t>0x</w:t>
-            </w:r>
-            <w:r>
-              <w:rPr>
-                <w:color w:val="C55A11" w:themeColor="accent2" w:themeShade="BF"/>
-                <w:kern w:val="0"/>
-                <w:sz w:val="20"/>
-                <w:szCs w:val="21"/>
-              </w:rPr>
-              <w:t>05</w:t>
-            </w:r>
-          </w:p>
-        </w:tc>
-        <w:tc>
-          <w:tcPr>
-            <w:tcW w:w="1702" w:type="dxa"/>
-          </w:tcPr>
-          <w:p>
-            <w:pPr>
-              <w:jc w:val="center"/>
-              <w:rPr>
-                <w:rFonts w:hint="eastAsia"/>
-                <w:color w:val="C55A11" w:themeColor="accent2" w:themeShade="BF"/>
-                <w:kern w:val="0"/>
-                <w:sz w:val="20"/>
-                <w:szCs w:val="21"/>
-              </w:rPr>
-            </w:pPr>
-            <w:r>
-              <w:rPr>
-                <w:rFonts w:hint="eastAsia"/>
-                <w:color w:val="ED7D31" w:themeColor="accent2"/>
-                <w:kern w:val="0"/>
-                <w:sz w:val="21"/>
-                <w:szCs w:val="21"/>
-                <w14:textFill>
-                  <w14:solidFill>
-                    <w14:schemeClr w14:val="accent2"/>
-                  </w14:solidFill>
-                </w14:textFill>
-              </w:rPr>
-              <w:t>0</w:t>
-            </w:r>
-            <w:r>
-              <w:rPr>
-                <w:color w:val="ED7D31" w:themeColor="accent2"/>
-                <w:kern w:val="0"/>
-                <w:sz w:val="21"/>
-                <w:szCs w:val="21"/>
-                <w14:textFill>
-                  <w14:solidFill>
-                    <w14:schemeClr w14:val="accent2"/>
-                  </w14:solidFill>
-                </w14:textFill>
-              </w:rPr>
-              <w:t>xXXXX</w:t>
-            </w:r>
-          </w:p>
-        </w:tc>
-        <w:tc>
-          <w:tcPr>
-            <w:tcW w:w="850" w:type="dxa"/>
-            <w:vMerge w:val="continue"/>
-          </w:tcPr>
-          <w:p>
-            <w:pPr>
-              <w:jc w:val="center"/>
-              <w:rPr>
-                <w:rFonts w:hint="eastAsia"/>
-                <w:color w:val="C55A11" w:themeColor="accent2" w:themeShade="BF"/>
-                <w:kern w:val="0"/>
-                <w:sz w:val="20"/>
-                <w:szCs w:val="21"/>
-              </w:rPr>
-            </w:pPr>
-          </w:p>
-        </w:tc>
-        <w:tc>
-          <w:tcPr>
-            <w:tcW w:w="4394" w:type="dxa"/>
-          </w:tcPr>
-          <w:p>
-            <w:pPr>
-              <w:rPr>
-                <w:rFonts w:hint="eastAsia"/>
-                <w:color w:val="C55A11" w:themeColor="accent2" w:themeShade="BF"/>
-                <w:kern w:val="0"/>
-                <w:sz w:val="20"/>
-                <w:szCs w:val="21"/>
-              </w:rPr>
-            </w:pPr>
-            <w:r>
-              <w:rPr>
-                <w:rFonts w:hint="eastAsia"/>
-                <w:color w:val="C55A11" w:themeColor="accent2" w:themeShade="BF"/>
-                <w:kern w:val="0"/>
-                <w:sz w:val="20"/>
-                <w:szCs w:val="21"/>
-              </w:rPr>
-              <w:t>超声波</w:t>
-            </w:r>
-            <w:r>
-              <w:rPr>
-                <w:color w:val="C55A11" w:themeColor="accent2" w:themeShade="BF"/>
-                <w:kern w:val="0"/>
-                <w:sz w:val="20"/>
-                <w:szCs w:val="21"/>
-              </w:rPr>
-              <w:t>电机</w:t>
-            </w:r>
-            <w:r>
-              <w:rPr>
-                <w:rFonts w:hint="eastAsia"/>
-                <w:color w:val="C55A11" w:themeColor="accent2" w:themeShade="BF"/>
-                <w:kern w:val="0"/>
-                <w:sz w:val="20"/>
-                <w:szCs w:val="21"/>
-              </w:rPr>
-              <w:t>最佳频点</w:t>
-            </w:r>
-          </w:p>
-        </w:tc>
-      </w:tr>
-      <w:tr>
-        <w:tblPrEx>
-          <w:tblBorders>
-            <w:top w:val="single" w:color="auto" w:sz="4" w:space="0"/>
-            <w:left w:val="single" w:color="auto" w:sz="4" w:space="0"/>
-            <w:bottom w:val="single" w:color="auto" w:sz="4" w:space="0"/>
-            <w:right w:val="single" w:color="auto" w:sz="4" w:space="0"/>
-            <w:insideH w:val="single" w:color="auto" w:sz="4" w:space="0"/>
-            <w:insideV w:val="single" w:color="auto" w:sz="4" w:space="0"/>
-          </w:tblBorders>
-        </w:tblPrEx>
-        <w:tc>
-          <w:tcPr>
-            <w:tcW w:w="993" w:type="dxa"/>
-            <w:vMerge w:val="continue"/>
-          </w:tcPr>
-          <w:p>
-            <w:pPr>
-              <w:rPr>
-                <w:rFonts w:hint="eastAsia"/>
-                <w:kern w:val="0"/>
-                <w:sz w:val="20"/>
-                <w:szCs w:val="21"/>
-              </w:rPr>
-            </w:pPr>
-          </w:p>
-        </w:tc>
-        <w:tc>
-          <w:tcPr>
-            <w:tcW w:w="708" w:type="dxa"/>
-          </w:tcPr>
-          <w:p>
-            <w:pPr>
-              <w:jc w:val="center"/>
-              <w:rPr>
-                <w:rFonts w:hint="eastAsia"/>
-                <w:color w:val="C55A11" w:themeColor="accent2" w:themeShade="BF"/>
-                <w:kern w:val="0"/>
-                <w:sz w:val="20"/>
-                <w:szCs w:val="21"/>
-              </w:rPr>
-            </w:pPr>
-            <w:r>
-              <w:rPr>
-                <w:rFonts w:hint="eastAsia"/>
-                <w:color w:val="C55A11" w:themeColor="accent2" w:themeShade="BF"/>
-                <w:kern w:val="0"/>
-                <w:sz w:val="20"/>
-                <w:szCs w:val="21"/>
-              </w:rPr>
-              <w:t>0x</w:t>
-            </w:r>
-            <w:r>
-              <w:rPr>
-                <w:color w:val="C55A11" w:themeColor="accent2" w:themeShade="BF"/>
-                <w:kern w:val="0"/>
-                <w:sz w:val="20"/>
-                <w:szCs w:val="21"/>
-              </w:rPr>
-              <w:t>06</w:t>
-            </w:r>
-          </w:p>
-        </w:tc>
-        <w:tc>
-          <w:tcPr>
-            <w:tcW w:w="1702" w:type="dxa"/>
-          </w:tcPr>
-          <w:p>
-            <w:pPr>
-              <w:jc w:val="center"/>
-              <w:rPr>
-                <w:rFonts w:hint="eastAsia"/>
-                <w:color w:val="C55A11" w:themeColor="accent2" w:themeShade="BF"/>
-                <w:kern w:val="0"/>
-                <w:sz w:val="20"/>
-                <w:szCs w:val="21"/>
-              </w:rPr>
-            </w:pPr>
-            <w:r>
-              <w:rPr>
-                <w:rFonts w:hint="eastAsia"/>
-                <w:color w:val="ED7D31" w:themeColor="accent2"/>
-                <w:kern w:val="0"/>
-                <w:sz w:val="21"/>
-                <w:szCs w:val="21"/>
-                <w14:textFill>
-                  <w14:solidFill>
-                    <w14:schemeClr w14:val="accent2"/>
-                  </w14:solidFill>
-                </w14:textFill>
-              </w:rPr>
-              <w:t>0</w:t>
-            </w:r>
-            <w:r>
-              <w:rPr>
-                <w:color w:val="ED7D31" w:themeColor="accent2"/>
-                <w:kern w:val="0"/>
-                <w:sz w:val="21"/>
-                <w:szCs w:val="21"/>
-                <w14:textFill>
-                  <w14:solidFill>
-                    <w14:schemeClr w14:val="accent2"/>
-                  </w14:solidFill>
-                </w14:textFill>
-              </w:rPr>
-              <w:t>xXXXX</w:t>
-            </w:r>
-          </w:p>
-        </w:tc>
-        <w:tc>
-          <w:tcPr>
-            <w:tcW w:w="850" w:type="dxa"/>
-            <w:vMerge w:val="continue"/>
-          </w:tcPr>
-          <w:p>
-            <w:pPr>
-              <w:jc w:val="center"/>
-              <w:rPr>
-                <w:rFonts w:hint="eastAsia"/>
-                <w:color w:val="C55A11" w:themeColor="accent2" w:themeShade="BF"/>
-                <w:kern w:val="0"/>
-                <w:sz w:val="20"/>
-                <w:szCs w:val="21"/>
-              </w:rPr>
-            </w:pPr>
-          </w:p>
-        </w:tc>
-        <w:tc>
-          <w:tcPr>
-            <w:tcW w:w="4394" w:type="dxa"/>
-          </w:tcPr>
-          <w:p>
-            <w:pPr>
-              <w:rPr>
-                <w:rFonts w:hint="eastAsia"/>
-                <w:color w:val="C55A11" w:themeColor="accent2" w:themeShade="BF"/>
-                <w:kern w:val="0"/>
-                <w:sz w:val="20"/>
-                <w:szCs w:val="21"/>
-              </w:rPr>
-            </w:pPr>
-            <w:r>
-              <w:rPr>
-                <w:rFonts w:hint="eastAsia"/>
-                <w:color w:val="C55A11" w:themeColor="accent2" w:themeShade="BF"/>
-                <w:kern w:val="0"/>
-                <w:sz w:val="20"/>
-                <w:szCs w:val="21"/>
-              </w:rPr>
-              <w:t>超声波</w:t>
-            </w:r>
-            <w:r>
-              <w:rPr>
-                <w:color w:val="C55A11" w:themeColor="accent2" w:themeShade="BF"/>
-                <w:kern w:val="0"/>
-                <w:sz w:val="20"/>
-                <w:szCs w:val="21"/>
-              </w:rPr>
-              <w:t>电机</w:t>
-            </w:r>
-            <w:r>
-              <w:rPr>
-                <w:rFonts w:hint="eastAsia"/>
-                <w:color w:val="C55A11" w:themeColor="accent2" w:themeShade="BF"/>
-                <w:kern w:val="0"/>
-                <w:sz w:val="20"/>
-                <w:szCs w:val="21"/>
-              </w:rPr>
-              <w:t>最佳频点对应速度</w:t>
-            </w:r>
-          </w:p>
-        </w:tc>
-      </w:tr>
-      <w:tr>
-        <w:tblPrEx>
-          <w:tblBorders>
-            <w:top w:val="single" w:color="auto" w:sz="4" w:space="0"/>
-            <w:left w:val="single" w:color="auto" w:sz="4" w:space="0"/>
-            <w:bottom w:val="single" w:color="auto" w:sz="4" w:space="0"/>
-            <w:right w:val="single" w:color="auto" w:sz="4" w:space="0"/>
-            <w:insideH w:val="single" w:color="auto" w:sz="4" w:space="0"/>
-            <w:insideV w:val="single" w:color="auto" w:sz="4" w:space="0"/>
-          </w:tblBorders>
-        </w:tblPrEx>
-        <w:tc>
-          <w:tcPr>
-            <w:tcW w:w="993" w:type="dxa"/>
-            <w:vMerge w:val="continue"/>
-          </w:tcPr>
-          <w:p>
-            <w:pPr>
-              <w:rPr>
-                <w:rFonts w:hint="eastAsia"/>
-                <w:kern w:val="0"/>
-                <w:sz w:val="21"/>
-                <w:szCs w:val="21"/>
-              </w:rPr>
-            </w:pPr>
-          </w:p>
-        </w:tc>
-        <w:tc>
-          <w:tcPr>
-            <w:tcW w:w="7654" w:type="dxa"/>
-            <w:gridSpan w:val="4"/>
-            <w:vAlign w:val="center"/>
-          </w:tcPr>
-          <w:p>
-            <w:pPr>
-              <w:rPr>
-                <w:rFonts w:hint="eastAsia"/>
-                <w:kern w:val="0"/>
-                <w:sz w:val="21"/>
-                <w:szCs w:val="21"/>
-              </w:rPr>
-            </w:pPr>
-          </w:p>
-        </w:tc>
-      </w:tr>
-      <w:tr>
-        <w:tblPrEx>
-          <w:tblBorders>
-            <w:top w:val="single" w:color="auto" w:sz="4" w:space="0"/>
-            <w:left w:val="single" w:color="auto" w:sz="4" w:space="0"/>
-            <w:bottom w:val="single" w:color="auto" w:sz="4" w:space="0"/>
-            <w:right w:val="single" w:color="auto" w:sz="4" w:space="0"/>
-            <w:insideH w:val="single" w:color="auto" w:sz="4" w:space="0"/>
-            <w:insideV w:val="single" w:color="auto" w:sz="4" w:space="0"/>
-          </w:tblBorders>
-        </w:tblPrEx>
-        <w:tc>
-          <w:tcPr>
-            <w:tcW w:w="993" w:type="dxa"/>
-            <w:vMerge w:val="continue"/>
-          </w:tcPr>
-          <w:p>
-            <w:pPr>
-              <w:rPr>
-                <w:rFonts w:hint="eastAsia"/>
-                <w:kern w:val="0"/>
-                <w:sz w:val="21"/>
-                <w:szCs w:val="21"/>
-              </w:rPr>
-            </w:pPr>
-          </w:p>
-        </w:tc>
-        <w:tc>
-          <w:tcPr>
-            <w:tcW w:w="708" w:type="dxa"/>
-          </w:tcPr>
-          <w:p>
-            <w:pPr>
-              <w:jc w:val="center"/>
-              <w:rPr>
-                <w:rFonts w:hint="eastAsia"/>
-                <w:kern w:val="0"/>
-                <w:sz w:val="21"/>
-                <w:szCs w:val="21"/>
-              </w:rPr>
-            </w:pPr>
-            <w:r>
-              <w:rPr>
-                <w:rFonts w:hint="eastAsia"/>
-                <w:kern w:val="0"/>
-                <w:sz w:val="21"/>
-                <w:szCs w:val="21"/>
-              </w:rPr>
-              <w:t>0</w:t>
-            </w:r>
-            <w:r>
-              <w:rPr>
-                <w:kern w:val="0"/>
-                <w:sz w:val="21"/>
-                <w:szCs w:val="21"/>
-              </w:rPr>
-              <w:t>x10</w:t>
-            </w:r>
-          </w:p>
-        </w:tc>
-        <w:tc>
-          <w:tcPr>
-            <w:tcW w:w="1702" w:type="dxa"/>
-          </w:tcPr>
-          <w:p>
-            <w:pPr>
-              <w:jc w:val="center"/>
-              <w:rPr>
-                <w:rFonts w:hint="eastAsia"/>
-                <w:kern w:val="0"/>
-                <w:sz w:val="21"/>
-                <w:szCs w:val="21"/>
-              </w:rPr>
-            </w:pPr>
-            <w:r>
-              <w:rPr>
-                <w:rFonts w:hint="eastAsia"/>
-                <w:kern w:val="0"/>
-                <w:sz w:val="21"/>
-                <w:szCs w:val="21"/>
-              </w:rPr>
-              <w:t>倍率</w:t>
-            </w:r>
-          </w:p>
-        </w:tc>
-        <w:tc>
-          <w:tcPr>
-            <w:tcW w:w="850" w:type="dxa"/>
-            <w:vMerge w:val="restart"/>
-            <w:vAlign w:val="center"/>
-          </w:tcPr>
-          <w:p>
-            <w:pPr>
-              <w:jc w:val="center"/>
-              <w:rPr>
-                <w:rFonts w:hint="eastAsia"/>
-                <w:kern w:val="0"/>
-                <w:sz w:val="21"/>
-                <w:szCs w:val="21"/>
-              </w:rPr>
-            </w:pPr>
-            <w:r>
-              <w:rPr>
-                <w:rFonts w:hint="eastAsia"/>
-                <w:kern w:val="0"/>
-                <w:sz w:val="21"/>
-                <w:szCs w:val="21"/>
-              </w:rPr>
-              <w:t>CRC16</w:t>
-            </w:r>
-          </w:p>
-        </w:tc>
-        <w:tc>
-          <w:tcPr>
-            <w:tcW w:w="4394" w:type="dxa"/>
-          </w:tcPr>
-          <w:p>
-            <w:pPr>
-              <w:rPr>
-                <w:rFonts w:hint="eastAsia"/>
-                <w:kern w:val="0"/>
-                <w:sz w:val="21"/>
-                <w:szCs w:val="21"/>
-              </w:rPr>
-            </w:pPr>
-            <w:r>
-              <w:rPr>
-                <w:rFonts w:hint="eastAsia"/>
-                <w:kern w:val="0"/>
-                <w:sz w:val="21"/>
-                <w:szCs w:val="21"/>
-              </w:rPr>
-              <w:t>向上位机发送镜头当前</w:t>
-            </w:r>
-            <w:r>
-              <w:rPr>
-                <w:kern w:val="0"/>
-                <w:sz w:val="21"/>
-                <w:szCs w:val="21"/>
-              </w:rPr>
-              <w:t>倍率</w:t>
-            </w:r>
-          </w:p>
-        </w:tc>
-      </w:tr>
-      <w:tr>
-        <w:tblPrEx>
-          <w:tblBorders>
-            <w:top w:val="single" w:color="auto" w:sz="4" w:space="0"/>
-            <w:left w:val="single" w:color="auto" w:sz="4" w:space="0"/>
-            <w:bottom w:val="single" w:color="auto" w:sz="4" w:space="0"/>
-            <w:right w:val="single" w:color="auto" w:sz="4" w:space="0"/>
-            <w:insideH w:val="single" w:color="auto" w:sz="4" w:space="0"/>
-            <w:insideV w:val="single" w:color="auto" w:sz="4" w:space="0"/>
-          </w:tblBorders>
-        </w:tblPrEx>
-        <w:tc>
-          <w:tcPr>
-            <w:tcW w:w="993" w:type="dxa"/>
-            <w:vMerge w:val="continue"/>
-          </w:tcPr>
-          <w:p>
-            <w:pPr>
-              <w:rPr>
-                <w:rFonts w:hint="eastAsia"/>
-                <w:kern w:val="0"/>
-                <w:sz w:val="21"/>
-                <w:szCs w:val="21"/>
-              </w:rPr>
-            </w:pPr>
-          </w:p>
-        </w:tc>
-        <w:tc>
-          <w:tcPr>
-            <w:tcW w:w="708" w:type="dxa"/>
-          </w:tcPr>
-          <w:p>
-            <w:pPr>
-              <w:jc w:val="center"/>
-              <w:rPr>
-                <w:rFonts w:hint="eastAsia"/>
-                <w:kern w:val="0"/>
-                <w:sz w:val="21"/>
-                <w:szCs w:val="21"/>
-              </w:rPr>
-            </w:pPr>
-            <w:r>
-              <w:rPr>
-                <w:rFonts w:hint="eastAsia"/>
-                <w:kern w:val="0"/>
-                <w:sz w:val="21"/>
-                <w:szCs w:val="21"/>
-              </w:rPr>
-              <w:t>0x</w:t>
-            </w:r>
-            <w:r>
-              <w:rPr>
-                <w:kern w:val="0"/>
-                <w:sz w:val="21"/>
-                <w:szCs w:val="21"/>
-              </w:rPr>
-              <w:t>11</w:t>
-            </w:r>
-          </w:p>
-        </w:tc>
-        <w:tc>
-          <w:tcPr>
-            <w:tcW w:w="1702" w:type="dxa"/>
-          </w:tcPr>
-          <w:p>
-            <w:pPr>
-              <w:jc w:val="center"/>
-              <w:rPr>
-                <w:rFonts w:hint="eastAsia"/>
-                <w:kern w:val="0"/>
-                <w:sz w:val="21"/>
-                <w:szCs w:val="21"/>
-              </w:rPr>
-            </w:pPr>
-            <w:r>
-              <w:rPr>
-                <w:kern w:val="0"/>
-                <w:sz w:val="21"/>
-                <w:szCs w:val="21"/>
-              </w:rPr>
-              <w:t>状态</w:t>
-            </w:r>
-          </w:p>
-        </w:tc>
-        <w:tc>
-          <w:tcPr>
-            <w:tcW w:w="850" w:type="dxa"/>
-            <w:vMerge w:val="continue"/>
-          </w:tcPr>
-          <w:p>
-            <w:pPr>
-              <w:jc w:val="center"/>
-              <w:rPr>
-                <w:rFonts w:hint="eastAsia"/>
-                <w:kern w:val="0"/>
-                <w:sz w:val="21"/>
-                <w:szCs w:val="21"/>
-              </w:rPr>
-            </w:pPr>
-          </w:p>
-        </w:tc>
-        <w:tc>
-          <w:tcPr>
-            <w:tcW w:w="4394" w:type="dxa"/>
-          </w:tcPr>
-          <w:p>
-            <w:pPr>
-              <w:rPr>
-                <w:rFonts w:hint="eastAsia"/>
-                <w:kern w:val="0"/>
-                <w:sz w:val="21"/>
-                <w:szCs w:val="21"/>
-              </w:rPr>
-            </w:pPr>
-            <w:r>
-              <w:rPr>
-                <w:rFonts w:hint="eastAsia"/>
-                <w:kern w:val="0"/>
-                <w:sz w:val="21"/>
-                <w:szCs w:val="21"/>
-              </w:rPr>
-              <w:t>向上位机发送镜头运行</w:t>
-            </w:r>
-            <w:r>
-              <w:rPr>
-                <w:kern w:val="0"/>
-                <w:sz w:val="21"/>
-                <w:szCs w:val="21"/>
-              </w:rPr>
-              <w:t>状态</w:t>
-            </w:r>
-          </w:p>
-        </w:tc>
-      </w:tr>
-      <w:tr>
-        <w:tblPrEx>
-          <w:tblBorders>
-            <w:top w:val="single" w:color="auto" w:sz="4" w:space="0"/>
-            <w:left w:val="single" w:color="auto" w:sz="4" w:space="0"/>
-            <w:bottom w:val="single" w:color="auto" w:sz="4" w:space="0"/>
-            <w:right w:val="single" w:color="auto" w:sz="4" w:space="0"/>
-            <w:insideH w:val="single" w:color="auto" w:sz="4" w:space="0"/>
-            <w:insideV w:val="single" w:color="auto" w:sz="4" w:space="0"/>
-          </w:tblBorders>
-        </w:tblPrEx>
-        <w:tc>
-          <w:tcPr>
-            <w:tcW w:w="993" w:type="dxa"/>
-            <w:vMerge w:val="continue"/>
-          </w:tcPr>
-          <w:p>
-            <w:pPr>
-              <w:rPr>
-                <w:rFonts w:hint="eastAsia"/>
-                <w:kern w:val="0"/>
-                <w:sz w:val="21"/>
-                <w:szCs w:val="21"/>
-              </w:rPr>
-            </w:pPr>
-          </w:p>
-        </w:tc>
-        <w:tc>
-          <w:tcPr>
-            <w:tcW w:w="708" w:type="dxa"/>
-          </w:tcPr>
-          <w:p>
-            <w:pPr>
-              <w:jc w:val="center"/>
-              <w:rPr>
-                <w:rFonts w:hint="eastAsia"/>
-                <w:color w:val="ED7D31" w:themeColor="accent2"/>
-                <w:kern w:val="0"/>
-                <w:sz w:val="21"/>
-                <w:szCs w:val="21"/>
-                <w14:textFill>
-                  <w14:solidFill>
-                    <w14:schemeClr w14:val="accent2"/>
-                  </w14:solidFill>
-                </w14:textFill>
-              </w:rPr>
-            </w:pPr>
-            <w:r>
-              <w:rPr>
-                <w:rFonts w:hint="eastAsia"/>
-                <w:color w:val="ED7D31" w:themeColor="accent2"/>
-                <w:kern w:val="0"/>
-                <w:sz w:val="21"/>
-                <w:szCs w:val="21"/>
-                <w14:textFill>
-                  <w14:solidFill>
-                    <w14:schemeClr w14:val="accent2"/>
-                  </w14:solidFill>
-                </w14:textFill>
-              </w:rPr>
-              <w:t>0x</w:t>
-            </w:r>
-            <w:r>
-              <w:rPr>
-                <w:color w:val="ED7D31" w:themeColor="accent2"/>
-                <w:kern w:val="0"/>
-                <w:sz w:val="21"/>
-                <w:szCs w:val="21"/>
-                <w14:textFill>
-                  <w14:solidFill>
-                    <w14:schemeClr w14:val="accent2"/>
-                  </w14:solidFill>
-                </w14:textFill>
-              </w:rPr>
-              <w:t>12</w:t>
-            </w:r>
-          </w:p>
-        </w:tc>
-        <w:tc>
-          <w:tcPr>
-            <w:tcW w:w="1702" w:type="dxa"/>
-          </w:tcPr>
-          <w:p>
-            <w:pPr>
-              <w:jc w:val="center"/>
-              <w:rPr>
-                <w:rFonts w:hint="eastAsia"/>
-                <w:color w:val="ED7D31" w:themeColor="accent2"/>
-                <w:kern w:val="0"/>
-                <w:sz w:val="21"/>
-                <w:szCs w:val="21"/>
-                <w14:textFill>
-                  <w14:solidFill>
-                    <w14:schemeClr w14:val="accent2"/>
-                  </w14:solidFill>
-                </w14:textFill>
-              </w:rPr>
-            </w:pPr>
-            <w:r>
-              <w:rPr>
-                <w:rFonts w:hint="eastAsia"/>
-                <w:color w:val="ED7D31" w:themeColor="accent2"/>
-                <w:kern w:val="0"/>
-                <w:sz w:val="21"/>
-                <w:szCs w:val="21"/>
-                <w14:textFill>
-                  <w14:solidFill>
-                    <w14:schemeClr w14:val="accent2"/>
-                  </w14:solidFill>
-                </w14:textFill>
-              </w:rPr>
-              <w:t>速度</w:t>
-            </w:r>
-          </w:p>
-        </w:tc>
-        <w:tc>
-          <w:tcPr>
-            <w:tcW w:w="850" w:type="dxa"/>
-            <w:vMerge w:val="continue"/>
-            <w:vAlign w:val="center"/>
-          </w:tcPr>
-          <w:p>
-            <w:pPr>
-              <w:jc w:val="center"/>
-              <w:rPr>
-                <w:rFonts w:hint="eastAsia"/>
-                <w:color w:val="ED7D31" w:themeColor="accent2"/>
-                <w:kern w:val="0"/>
-                <w:sz w:val="21"/>
-                <w:szCs w:val="21"/>
-                <w14:textFill>
-                  <w14:solidFill>
-                    <w14:schemeClr w14:val="accent2"/>
-                  </w14:solidFill>
-                </w14:textFill>
-              </w:rPr>
-            </w:pPr>
-          </w:p>
-        </w:tc>
-        <w:tc>
-          <w:tcPr>
-            <w:tcW w:w="4394" w:type="dxa"/>
-          </w:tcPr>
-          <w:p>
-            <w:pPr>
-              <w:rPr>
-                <w:rFonts w:hint="eastAsia"/>
-                <w:color w:val="ED7D31" w:themeColor="accent2"/>
-                <w:kern w:val="0"/>
-                <w:sz w:val="21"/>
-                <w:szCs w:val="21"/>
-                <w14:textFill>
-                  <w14:solidFill>
-                    <w14:schemeClr w14:val="accent2"/>
-                  </w14:solidFill>
-                </w14:textFill>
-              </w:rPr>
-            </w:pPr>
-            <w:r>
-              <w:rPr>
-                <w:rFonts w:hint="eastAsia"/>
-                <w:color w:val="ED7D31" w:themeColor="accent2"/>
-                <w:kern w:val="0"/>
-                <w:sz w:val="21"/>
-                <w:szCs w:val="21"/>
-                <w14:textFill>
-                  <w14:solidFill>
-                    <w14:schemeClr w14:val="accent2"/>
-                  </w14:solidFill>
-                </w14:textFill>
-              </w:rPr>
-              <w:t>向上位机发送镜头运行</w:t>
-            </w:r>
-            <w:r>
-              <w:rPr>
-                <w:color w:val="ED7D31" w:themeColor="accent2"/>
-                <w:kern w:val="0"/>
-                <w:sz w:val="21"/>
-                <w:szCs w:val="21"/>
-                <w14:textFill>
-                  <w14:solidFill>
-                    <w14:schemeClr w14:val="accent2"/>
-                  </w14:solidFill>
-                </w14:textFill>
-              </w:rPr>
-              <w:t>速度</w:t>
-            </w:r>
-          </w:p>
-        </w:tc>
-      </w:tr>
-      <w:tr>
-        <w:tblPrEx>
-          <w:tblBorders>
-            <w:top w:val="single" w:color="auto" w:sz="4" w:space="0"/>
-            <w:left w:val="single" w:color="auto" w:sz="4" w:space="0"/>
-            <w:bottom w:val="single" w:color="auto" w:sz="4" w:space="0"/>
-            <w:right w:val="single" w:color="auto" w:sz="4" w:space="0"/>
-            <w:insideH w:val="single" w:color="auto" w:sz="4" w:space="0"/>
-            <w:insideV w:val="single" w:color="auto" w:sz="4" w:space="0"/>
-          </w:tblBorders>
-        </w:tblPrEx>
-        <w:tc>
-          <w:tcPr>
-            <w:tcW w:w="993" w:type="dxa"/>
-            <w:vMerge w:val="continue"/>
-          </w:tcPr>
-          <w:p>
-            <w:pPr>
-              <w:rPr>
-                <w:rFonts w:hint="eastAsia"/>
-                <w:kern w:val="0"/>
-                <w:sz w:val="20"/>
-                <w:szCs w:val="21"/>
-              </w:rPr>
-            </w:pPr>
-          </w:p>
-        </w:tc>
-        <w:tc>
-          <w:tcPr>
-            <w:tcW w:w="708" w:type="dxa"/>
-          </w:tcPr>
-          <w:p>
-            <w:pPr>
-              <w:jc w:val="center"/>
-              <w:rPr>
-                <w:rFonts w:hint="eastAsia"/>
-                <w:color w:val="ED7D31" w:themeColor="accent2"/>
-                <w:kern w:val="0"/>
-                <w:sz w:val="20"/>
-                <w:szCs w:val="21"/>
-                <w14:textFill>
-                  <w14:solidFill>
-                    <w14:schemeClr w14:val="accent2"/>
-                  </w14:solidFill>
-                </w14:textFill>
-              </w:rPr>
-            </w:pPr>
-            <w:r>
-              <w:rPr>
-                <w:rFonts w:hint="eastAsia"/>
-                <w:color w:val="ED7D31" w:themeColor="accent2"/>
-                <w:kern w:val="0"/>
-                <w:sz w:val="21"/>
-                <w:szCs w:val="21"/>
-                <w14:textFill>
-                  <w14:solidFill>
-                    <w14:schemeClr w14:val="accent2"/>
-                  </w14:solidFill>
-                </w14:textFill>
-              </w:rPr>
-              <w:t>0x</w:t>
-            </w:r>
-            <w:r>
-              <w:rPr>
-                <w:color w:val="ED7D31" w:themeColor="accent2"/>
-                <w:kern w:val="0"/>
-                <w:sz w:val="21"/>
-                <w:szCs w:val="21"/>
-                <w14:textFill>
-                  <w14:solidFill>
-                    <w14:schemeClr w14:val="accent2"/>
-                  </w14:solidFill>
-                </w14:textFill>
-              </w:rPr>
-              <w:t>13</w:t>
-            </w:r>
-          </w:p>
-        </w:tc>
-        <w:tc>
-          <w:tcPr>
-            <w:tcW w:w="1702" w:type="dxa"/>
-          </w:tcPr>
-          <w:p>
-            <w:pPr>
-              <w:jc w:val="center"/>
-              <w:rPr>
-                <w:rFonts w:hint="eastAsia"/>
-                <w:color w:val="ED7D31" w:themeColor="accent2"/>
-                <w:kern w:val="0"/>
-                <w:sz w:val="20"/>
-                <w:szCs w:val="21"/>
-                <w14:textFill>
-                  <w14:solidFill>
-                    <w14:schemeClr w14:val="accent2"/>
-                  </w14:solidFill>
-                </w14:textFill>
-              </w:rPr>
-            </w:pPr>
-            <w:r>
-              <w:rPr>
-                <w:rFonts w:hint="eastAsia"/>
-                <w:color w:val="ED7D31" w:themeColor="accent2"/>
-                <w:kern w:val="0"/>
-                <w:sz w:val="20"/>
-                <w:szCs w:val="21"/>
-                <w14:textFill>
-                  <w14:solidFill>
-                    <w14:schemeClr w14:val="accent2"/>
-                  </w14:solidFill>
-                </w14:textFill>
-              </w:rPr>
-              <w:t>类型</w:t>
-            </w:r>
-          </w:p>
-        </w:tc>
-        <w:tc>
-          <w:tcPr>
-            <w:tcW w:w="850" w:type="dxa"/>
-            <w:vMerge w:val="continue"/>
-            <w:vAlign w:val="center"/>
-          </w:tcPr>
-          <w:p>
-            <w:pPr>
-              <w:jc w:val="center"/>
-              <w:rPr>
-                <w:rFonts w:hint="eastAsia"/>
-                <w:color w:val="ED7D31" w:themeColor="accent2"/>
-                <w:kern w:val="0"/>
-                <w:sz w:val="20"/>
-                <w:szCs w:val="21"/>
-                <w14:textFill>
-                  <w14:solidFill>
-                    <w14:schemeClr w14:val="accent2"/>
-                  </w14:solidFill>
-                </w14:textFill>
-              </w:rPr>
-            </w:pPr>
-          </w:p>
-        </w:tc>
-        <w:tc>
-          <w:tcPr>
-            <w:tcW w:w="4394" w:type="dxa"/>
-          </w:tcPr>
-          <w:p>
-            <w:pPr>
-              <w:rPr>
-                <w:rFonts w:hint="eastAsia"/>
-                <w:color w:val="ED7D31" w:themeColor="accent2"/>
-                <w:kern w:val="0"/>
-                <w:sz w:val="21"/>
-                <w:szCs w:val="21"/>
-                <w14:textFill>
-                  <w14:solidFill>
-                    <w14:schemeClr w14:val="accent2"/>
-                  </w14:solidFill>
-                </w14:textFill>
-              </w:rPr>
-            </w:pPr>
-            <w:r>
-              <w:rPr>
-                <w:rFonts w:hint="eastAsia"/>
-                <w:color w:val="ED7D31" w:themeColor="accent2"/>
-                <w:kern w:val="0"/>
-                <w:sz w:val="21"/>
-                <w:szCs w:val="21"/>
-                <w14:textFill>
-                  <w14:solidFill>
-                    <w14:schemeClr w14:val="accent2"/>
-                  </w14:solidFill>
-                </w14:textFill>
-              </w:rPr>
-              <w:t>向上位机发送镜头类型</w:t>
-            </w:r>
-          </w:p>
-        </w:tc>
-      </w:tr>
-      <w:tr>
-        <w:tblPrEx>
-          <w:tblBorders>
-            <w:top w:val="single" w:color="auto" w:sz="4" w:space="0"/>
-            <w:left w:val="single" w:color="auto" w:sz="4" w:space="0"/>
-            <w:bottom w:val="single" w:color="auto" w:sz="4" w:space="0"/>
-            <w:right w:val="single" w:color="auto" w:sz="4" w:space="0"/>
-            <w:insideH w:val="single" w:color="auto" w:sz="4" w:space="0"/>
-            <w:insideV w:val="single" w:color="auto" w:sz="4" w:space="0"/>
-          </w:tblBorders>
-        </w:tblPrEx>
-        <w:tc>
-          <w:tcPr>
-            <w:tcW w:w="993" w:type="dxa"/>
-            <w:vMerge w:val="continue"/>
-          </w:tcPr>
-          <w:p>
-            <w:pPr>
-              <w:rPr>
-                <w:rFonts w:hint="eastAsia"/>
-                <w:kern w:val="0"/>
-                <w:sz w:val="20"/>
-                <w:szCs w:val="21"/>
-              </w:rPr>
-            </w:pPr>
-          </w:p>
-        </w:tc>
-        <w:tc>
-          <w:tcPr>
-            <w:tcW w:w="708" w:type="dxa"/>
-          </w:tcPr>
-          <w:p>
-            <w:pPr>
-              <w:jc w:val="center"/>
-              <w:rPr>
-                <w:rFonts w:hint="eastAsia"/>
-                <w:kern w:val="0"/>
-                <w:sz w:val="20"/>
-                <w:szCs w:val="21"/>
-              </w:rPr>
-            </w:pPr>
-            <w:r>
-              <w:rPr>
-                <w:rFonts w:hint="eastAsia"/>
-                <w:kern w:val="0"/>
-                <w:sz w:val="21"/>
-                <w:szCs w:val="21"/>
-              </w:rPr>
-              <w:t>0x</w:t>
-            </w:r>
-            <w:r>
-              <w:rPr>
-                <w:kern w:val="0"/>
-                <w:sz w:val="21"/>
-                <w:szCs w:val="21"/>
-              </w:rPr>
-              <w:t>14</w:t>
-            </w:r>
-          </w:p>
-        </w:tc>
-        <w:tc>
-          <w:tcPr>
-            <w:tcW w:w="1702" w:type="dxa"/>
-          </w:tcPr>
-          <w:p>
-            <w:pPr>
-              <w:jc w:val="center"/>
-              <w:rPr>
-                <w:rFonts w:hint="eastAsia"/>
-                <w:kern w:val="0"/>
-                <w:sz w:val="20"/>
-                <w:szCs w:val="21"/>
-              </w:rPr>
-            </w:pPr>
-            <w:r>
-              <w:rPr>
-                <w:rFonts w:hint="eastAsia"/>
-                <w:kern w:val="0"/>
-                <w:sz w:val="20"/>
-                <w:szCs w:val="21"/>
-              </w:rPr>
-              <w:t>最小</w:t>
-            </w:r>
-            <w:r>
-              <w:rPr>
-                <w:kern w:val="0"/>
-                <w:sz w:val="20"/>
-                <w:szCs w:val="21"/>
-              </w:rPr>
-              <w:t>倍率</w:t>
-            </w:r>
-          </w:p>
-        </w:tc>
-        <w:tc>
-          <w:tcPr>
-            <w:tcW w:w="850" w:type="dxa"/>
-            <w:vMerge w:val="continue"/>
-            <w:vAlign w:val="center"/>
-          </w:tcPr>
-          <w:p>
-            <w:pPr>
-              <w:jc w:val="center"/>
-              <w:rPr>
-                <w:rFonts w:hint="eastAsia"/>
-                <w:color w:val="ED7D31" w:themeColor="accent2"/>
-                <w:kern w:val="0"/>
-                <w:sz w:val="20"/>
-                <w:szCs w:val="21"/>
-                <w14:textFill>
-                  <w14:solidFill>
-                    <w14:schemeClr w14:val="accent2"/>
-                  </w14:solidFill>
-                </w14:textFill>
-              </w:rPr>
-            </w:pPr>
-          </w:p>
-        </w:tc>
-        <w:tc>
-          <w:tcPr>
-            <w:tcW w:w="4394" w:type="dxa"/>
-          </w:tcPr>
-          <w:p>
-            <w:pPr>
-              <w:rPr>
-                <w:rFonts w:hint="eastAsia"/>
-                <w:color w:val="ED7D31" w:themeColor="accent2"/>
-                <w:kern w:val="0"/>
-                <w:sz w:val="20"/>
-                <w:szCs w:val="21"/>
-                <w14:textFill>
-                  <w14:solidFill>
-                    <w14:schemeClr w14:val="accent2"/>
-                  </w14:solidFill>
-                </w14:textFill>
-              </w:rPr>
-            </w:pPr>
-            <w:r>
-              <w:rPr>
-                <w:rFonts w:hint="eastAsia"/>
-                <w:kern w:val="0"/>
-                <w:sz w:val="21"/>
-                <w:szCs w:val="21"/>
-              </w:rPr>
-              <w:t>向上位机发送镜头最小倍率</w:t>
-            </w:r>
-          </w:p>
-        </w:tc>
-      </w:tr>
-      <w:tr>
-        <w:tblPrEx>
-          <w:tblBorders>
-            <w:top w:val="single" w:color="auto" w:sz="4" w:space="0"/>
-            <w:left w:val="single" w:color="auto" w:sz="4" w:space="0"/>
-            <w:bottom w:val="single" w:color="auto" w:sz="4" w:space="0"/>
-            <w:right w:val="single" w:color="auto" w:sz="4" w:space="0"/>
-            <w:insideH w:val="single" w:color="auto" w:sz="4" w:space="0"/>
-            <w:insideV w:val="single" w:color="auto" w:sz="4" w:space="0"/>
-          </w:tblBorders>
-        </w:tblPrEx>
-        <w:tc>
-          <w:tcPr>
-            <w:tcW w:w="993" w:type="dxa"/>
-            <w:vMerge w:val="continue"/>
-          </w:tcPr>
-          <w:p>
-            <w:pPr>
-              <w:rPr>
-                <w:rFonts w:hint="eastAsia"/>
-                <w:kern w:val="0"/>
-                <w:sz w:val="20"/>
-                <w:szCs w:val="21"/>
-              </w:rPr>
-            </w:pPr>
-          </w:p>
-        </w:tc>
-        <w:tc>
-          <w:tcPr>
-            <w:tcW w:w="708" w:type="dxa"/>
-          </w:tcPr>
-          <w:p>
-            <w:pPr>
-              <w:jc w:val="center"/>
-              <w:rPr>
-                <w:rFonts w:hint="eastAsia"/>
-                <w:kern w:val="0"/>
-                <w:sz w:val="20"/>
-                <w:szCs w:val="21"/>
-              </w:rPr>
-            </w:pPr>
-            <w:r>
-              <w:rPr>
-                <w:rFonts w:hint="eastAsia"/>
-                <w:kern w:val="0"/>
-                <w:sz w:val="21"/>
-                <w:szCs w:val="21"/>
-              </w:rPr>
-              <w:t>0x</w:t>
-            </w:r>
-            <w:r>
-              <w:rPr>
-                <w:kern w:val="0"/>
-                <w:sz w:val="21"/>
-                <w:szCs w:val="21"/>
-              </w:rPr>
-              <w:t>15</w:t>
-            </w:r>
-          </w:p>
-        </w:tc>
-        <w:tc>
-          <w:tcPr>
-            <w:tcW w:w="1702" w:type="dxa"/>
-          </w:tcPr>
-          <w:p>
-            <w:pPr>
-              <w:jc w:val="center"/>
-              <w:rPr>
-                <w:rFonts w:hint="eastAsia"/>
-                <w:kern w:val="0"/>
-                <w:sz w:val="20"/>
-                <w:szCs w:val="21"/>
-              </w:rPr>
-            </w:pPr>
-            <w:r>
-              <w:rPr>
-                <w:rFonts w:hint="eastAsia"/>
-                <w:kern w:val="0"/>
-                <w:sz w:val="20"/>
-                <w:szCs w:val="21"/>
-              </w:rPr>
-              <w:t>最大</w:t>
-            </w:r>
-            <w:r>
-              <w:rPr>
-                <w:kern w:val="0"/>
-                <w:sz w:val="20"/>
-                <w:szCs w:val="21"/>
-              </w:rPr>
-              <w:t>倍率</w:t>
-            </w:r>
-          </w:p>
-        </w:tc>
-        <w:tc>
-          <w:tcPr>
-            <w:tcW w:w="850" w:type="dxa"/>
-            <w:vMerge w:val="continue"/>
-            <w:vAlign w:val="center"/>
-          </w:tcPr>
-          <w:p>
-            <w:pPr>
-              <w:jc w:val="center"/>
-              <w:rPr>
-                <w:rFonts w:hint="eastAsia"/>
-                <w:color w:val="ED7D31" w:themeColor="accent2"/>
-                <w:kern w:val="0"/>
-                <w:sz w:val="20"/>
-                <w:szCs w:val="21"/>
-                <w14:textFill>
-                  <w14:solidFill>
-                    <w14:schemeClr w14:val="accent2"/>
-                  </w14:solidFill>
-                </w14:textFill>
-              </w:rPr>
-            </w:pPr>
-          </w:p>
-        </w:tc>
-        <w:tc>
-          <w:tcPr>
-            <w:tcW w:w="4394" w:type="dxa"/>
-          </w:tcPr>
-          <w:p>
-            <w:pPr>
-              <w:rPr>
-                <w:rFonts w:hint="eastAsia"/>
-                <w:color w:val="ED7D31" w:themeColor="accent2"/>
-                <w:kern w:val="0"/>
-                <w:sz w:val="20"/>
-                <w:szCs w:val="21"/>
-                <w14:textFill>
-                  <w14:solidFill>
-                    <w14:schemeClr w14:val="accent2"/>
-                  </w14:solidFill>
-                </w14:textFill>
-              </w:rPr>
-            </w:pPr>
-            <w:r>
-              <w:rPr>
-                <w:rFonts w:hint="eastAsia"/>
-                <w:kern w:val="0"/>
-                <w:sz w:val="21"/>
-                <w:szCs w:val="21"/>
-              </w:rPr>
-              <w:t>向上位机发送镜头最大倍率</w:t>
-            </w:r>
-          </w:p>
-        </w:tc>
-      </w:tr>
-      <w:tr>
-        <w:tblPrEx>
-          <w:tblBorders>
-            <w:top w:val="single" w:color="auto" w:sz="4" w:space="0"/>
-            <w:left w:val="single" w:color="auto" w:sz="4" w:space="0"/>
-            <w:bottom w:val="single" w:color="auto" w:sz="4" w:space="0"/>
-            <w:right w:val="single" w:color="auto" w:sz="4" w:space="0"/>
-            <w:insideH w:val="single" w:color="auto" w:sz="4" w:space="0"/>
-            <w:insideV w:val="single" w:color="auto" w:sz="4" w:space="0"/>
-          </w:tblBorders>
-        </w:tblPrEx>
-        <w:tc>
-          <w:tcPr>
-            <w:tcW w:w="993" w:type="dxa"/>
-            <w:vMerge w:val="continue"/>
-          </w:tcPr>
-          <w:p>
-            <w:pPr>
-              <w:rPr>
-                <w:rFonts w:hint="eastAsia"/>
-                <w:kern w:val="0"/>
-                <w:sz w:val="20"/>
-                <w:szCs w:val="21"/>
-              </w:rPr>
-            </w:pPr>
-          </w:p>
-        </w:tc>
-        <w:tc>
-          <w:tcPr>
-            <w:tcW w:w="708" w:type="dxa"/>
-          </w:tcPr>
-          <w:p>
-            <w:pPr>
-              <w:jc w:val="center"/>
-              <w:rPr>
-                <w:rFonts w:hint="eastAsia"/>
-                <w:kern w:val="0"/>
-                <w:sz w:val="20"/>
-                <w:szCs w:val="21"/>
-              </w:rPr>
-            </w:pPr>
-            <w:r>
-              <w:rPr>
-                <w:rFonts w:hint="eastAsia"/>
-                <w:kern w:val="0"/>
-                <w:sz w:val="21"/>
-                <w:szCs w:val="21"/>
-              </w:rPr>
-              <w:t>0x</w:t>
-            </w:r>
-            <w:r>
-              <w:rPr>
-                <w:kern w:val="0"/>
-                <w:sz w:val="21"/>
-                <w:szCs w:val="21"/>
-              </w:rPr>
-              <w:t>1</w:t>
-            </w:r>
-            <w:r>
-              <w:rPr>
-                <w:rFonts w:hint="eastAsia"/>
-                <w:kern w:val="0"/>
-                <w:sz w:val="21"/>
-                <w:szCs w:val="21"/>
-              </w:rPr>
-              <w:t>6</w:t>
-            </w:r>
-          </w:p>
-        </w:tc>
-        <w:tc>
-          <w:tcPr>
-            <w:tcW w:w="1702" w:type="dxa"/>
-          </w:tcPr>
-          <w:p>
-            <w:pPr>
-              <w:jc w:val="center"/>
-              <w:rPr>
-                <w:rFonts w:hint="eastAsia"/>
-                <w:kern w:val="0"/>
-                <w:sz w:val="20"/>
-                <w:szCs w:val="21"/>
-              </w:rPr>
-            </w:pPr>
-            <w:r>
-              <w:rPr>
-                <w:rFonts w:hint="eastAsia"/>
-                <w:kern w:val="0"/>
-                <w:sz w:val="20"/>
-                <w:szCs w:val="21"/>
-              </w:rPr>
-              <w:t>版本信息</w:t>
-            </w:r>
-          </w:p>
-        </w:tc>
-        <w:tc>
-          <w:tcPr>
-            <w:tcW w:w="850" w:type="dxa"/>
-            <w:vMerge w:val="continue"/>
-            <w:vAlign w:val="center"/>
-          </w:tcPr>
-          <w:p>
-            <w:pPr>
-              <w:jc w:val="center"/>
-              <w:rPr>
-                <w:rFonts w:hint="eastAsia"/>
-                <w:color w:val="ED7D31" w:themeColor="accent2"/>
-                <w:kern w:val="0"/>
-                <w:sz w:val="20"/>
-                <w:szCs w:val="21"/>
-                <w14:textFill>
-                  <w14:solidFill>
-                    <w14:schemeClr w14:val="accent2"/>
-                  </w14:solidFill>
-                </w14:textFill>
-              </w:rPr>
-            </w:pPr>
-          </w:p>
-        </w:tc>
-        <w:tc>
-          <w:tcPr>
-            <w:tcW w:w="4394" w:type="dxa"/>
-          </w:tcPr>
-          <w:p>
-            <w:pPr>
-              <w:rPr>
-                <w:rFonts w:hint="eastAsia"/>
-                <w:kern w:val="0"/>
-                <w:sz w:val="20"/>
-                <w:szCs w:val="21"/>
-              </w:rPr>
-            </w:pPr>
-            <w:r>
-              <w:rPr>
-                <w:rFonts w:hint="eastAsia"/>
-                <w:color w:val="ED7D31" w:themeColor="accent2"/>
-                <w:kern w:val="0"/>
-                <w:sz w:val="21"/>
-                <w:szCs w:val="21"/>
-                <w14:textFill>
-                  <w14:solidFill>
-                    <w14:schemeClr w14:val="accent2"/>
-                  </w14:solidFill>
-                </w14:textFill>
-              </w:rPr>
-              <w:t>向上位机发送镜头固件版本信息</w:t>
-            </w:r>
-          </w:p>
-        </w:tc>
-      </w:tr>
-      <w:tr>
-        <w:tblPrEx>
-          <w:tblBorders>
-            <w:top w:val="single" w:color="auto" w:sz="4" w:space="0"/>
-            <w:left w:val="single" w:color="auto" w:sz="4" w:space="0"/>
-            <w:bottom w:val="single" w:color="auto" w:sz="4" w:space="0"/>
-            <w:right w:val="single" w:color="auto" w:sz="4" w:space="0"/>
-            <w:insideH w:val="single" w:color="auto" w:sz="4" w:space="0"/>
-            <w:insideV w:val="single" w:color="auto" w:sz="4" w:space="0"/>
-          </w:tblBorders>
-        </w:tblPrEx>
-        <w:tc>
-          <w:tcPr>
-            <w:tcW w:w="993" w:type="dxa"/>
-            <w:vMerge w:val="continue"/>
-          </w:tcPr>
-          <w:p>
-            <w:pPr>
-              <w:rPr>
-                <w:rFonts w:hint="eastAsia"/>
-                <w:kern w:val="0"/>
-                <w:sz w:val="20"/>
-                <w:szCs w:val="21"/>
-              </w:rPr>
-            </w:pPr>
-          </w:p>
-        </w:tc>
-        <w:tc>
-          <w:tcPr>
-            <w:tcW w:w="7654" w:type="dxa"/>
-            <w:gridSpan w:val="4"/>
-          </w:tcPr>
-          <w:p>
-            <w:pPr>
-              <w:rPr>
-                <w:rFonts w:hint="eastAsia"/>
-                <w:kern w:val="0"/>
-                <w:sz w:val="20"/>
-                <w:szCs w:val="21"/>
-              </w:rPr>
-            </w:pPr>
-          </w:p>
-        </w:tc>
-      </w:tr>
-      <w:tr>
-        <w:tblPrEx>
-          <w:tblBorders>
-            <w:top w:val="single" w:color="auto" w:sz="4" w:space="0"/>
-            <w:left w:val="single" w:color="auto" w:sz="4" w:space="0"/>
-            <w:bottom w:val="single" w:color="auto" w:sz="4" w:space="0"/>
-            <w:right w:val="single" w:color="auto" w:sz="4" w:space="0"/>
-            <w:insideH w:val="single" w:color="auto" w:sz="4" w:space="0"/>
-            <w:insideV w:val="single" w:color="auto" w:sz="4" w:space="0"/>
-          </w:tblBorders>
-        </w:tblPrEx>
-        <w:tc>
-          <w:tcPr>
-            <w:tcW w:w="993" w:type="dxa"/>
-            <w:vMerge w:val="continue"/>
-          </w:tcPr>
-          <w:p>
-            <w:pPr>
-              <w:rPr>
-                <w:rFonts w:hint="eastAsia"/>
-                <w:kern w:val="0"/>
-                <w:sz w:val="20"/>
-                <w:szCs w:val="21"/>
-              </w:rPr>
-            </w:pPr>
-          </w:p>
-        </w:tc>
-        <w:tc>
-          <w:tcPr>
-            <w:tcW w:w="708" w:type="dxa"/>
-            <w:vAlign w:val="center"/>
-          </w:tcPr>
-          <w:p>
-            <w:pPr>
-              <w:jc w:val="center"/>
-              <w:rPr>
-                <w:rFonts w:hint="eastAsia"/>
-                <w:kern w:val="0"/>
-                <w:sz w:val="21"/>
-                <w:szCs w:val="21"/>
-              </w:rPr>
-            </w:pPr>
-            <w:r>
-              <w:rPr>
-                <w:rFonts w:hint="eastAsia"/>
-                <w:kern w:val="0"/>
-                <w:sz w:val="21"/>
-                <w:szCs w:val="21"/>
-              </w:rPr>
-              <w:t>0x</w:t>
-            </w:r>
-            <w:r>
-              <w:rPr>
-                <w:kern w:val="0"/>
-                <w:sz w:val="21"/>
-                <w:szCs w:val="21"/>
-              </w:rPr>
-              <w:t>E0</w:t>
-            </w:r>
-          </w:p>
-        </w:tc>
-        <w:tc>
-          <w:tcPr>
-            <w:tcW w:w="1702" w:type="dxa"/>
-          </w:tcPr>
-          <w:p>
-            <w:pPr>
-              <w:jc w:val="center"/>
-              <w:rPr>
-                <w:rFonts w:hint="eastAsia"/>
-                <w:i/>
-                <w:kern w:val="0"/>
-                <w:sz w:val="21"/>
-                <w:szCs w:val="21"/>
-              </w:rPr>
-            </w:pPr>
-            <w:r>
-              <w:rPr>
-                <w:rFonts w:hint="eastAsia"/>
-                <w:i/>
-                <w:kern w:val="0"/>
-                <w:sz w:val="21"/>
-                <w:szCs w:val="21"/>
-              </w:rPr>
-              <w:t>保留字节</w:t>
-            </w:r>
-          </w:p>
-        </w:tc>
-        <w:tc>
-          <w:tcPr>
-            <w:tcW w:w="850" w:type="dxa"/>
-            <w:vMerge w:val="restart"/>
-            <w:vAlign w:val="center"/>
-          </w:tcPr>
-          <w:p>
-            <w:pPr>
-              <w:jc w:val="center"/>
-              <w:rPr>
-                <w:rFonts w:hint="eastAsia"/>
-                <w:kern w:val="0"/>
-                <w:sz w:val="21"/>
-                <w:szCs w:val="21"/>
-              </w:rPr>
-            </w:pPr>
-            <w:r>
-              <w:rPr>
-                <w:rFonts w:hint="eastAsia"/>
-                <w:kern w:val="0"/>
-                <w:sz w:val="21"/>
-                <w:szCs w:val="21"/>
-              </w:rPr>
-              <w:t>CRC16</w:t>
-            </w:r>
-          </w:p>
-        </w:tc>
-        <w:tc>
-          <w:tcPr>
-            <w:tcW w:w="4394" w:type="dxa"/>
-          </w:tcPr>
-          <w:p>
-            <w:pPr>
-              <w:rPr>
-                <w:rFonts w:hint="eastAsia"/>
-                <w:kern w:val="0"/>
-                <w:sz w:val="21"/>
-                <w:szCs w:val="21"/>
-              </w:rPr>
-            </w:pPr>
-            <w:r>
-              <w:rPr>
-                <w:rFonts w:hint="eastAsia"/>
-                <w:kern w:val="0"/>
-                <w:sz w:val="21"/>
-                <w:szCs w:val="21"/>
-              </w:rPr>
-              <w:t>命令</w:t>
-            </w:r>
-            <w:r>
-              <w:rPr>
-                <w:kern w:val="0"/>
-                <w:sz w:val="21"/>
-                <w:szCs w:val="21"/>
-              </w:rPr>
-              <w:t>参数错误</w:t>
-            </w:r>
-          </w:p>
-        </w:tc>
-      </w:tr>
-      <w:tr>
-        <w:tblPrEx>
-          <w:tblBorders>
-            <w:top w:val="single" w:color="auto" w:sz="4" w:space="0"/>
-            <w:left w:val="single" w:color="auto" w:sz="4" w:space="0"/>
-            <w:bottom w:val="single" w:color="auto" w:sz="4" w:space="0"/>
-            <w:right w:val="single" w:color="auto" w:sz="4" w:space="0"/>
-            <w:insideH w:val="single" w:color="auto" w:sz="4" w:space="0"/>
-            <w:insideV w:val="single" w:color="auto" w:sz="4" w:space="0"/>
-          </w:tblBorders>
-        </w:tblPrEx>
-        <w:tc>
-          <w:tcPr>
-            <w:tcW w:w="993" w:type="dxa"/>
-            <w:vMerge w:val="continue"/>
-          </w:tcPr>
-          <w:p>
-            <w:pPr>
-              <w:rPr>
-                <w:rFonts w:hint="eastAsia"/>
-                <w:kern w:val="0"/>
-                <w:sz w:val="20"/>
-                <w:szCs w:val="21"/>
-              </w:rPr>
-            </w:pPr>
-          </w:p>
-        </w:tc>
-        <w:tc>
-          <w:tcPr>
-            <w:tcW w:w="708" w:type="dxa"/>
-          </w:tcPr>
-          <w:p>
-            <w:pPr>
-              <w:jc w:val="center"/>
-              <w:rPr>
-                <w:rFonts w:hint="eastAsia"/>
-                <w:kern w:val="0"/>
-                <w:sz w:val="21"/>
-                <w:szCs w:val="21"/>
-              </w:rPr>
-            </w:pPr>
-            <w:r>
-              <w:rPr>
-                <w:rFonts w:hint="eastAsia"/>
-                <w:kern w:val="0"/>
-                <w:sz w:val="21"/>
-                <w:szCs w:val="21"/>
-              </w:rPr>
-              <w:t>0x</w:t>
-            </w:r>
-            <w:r>
-              <w:rPr>
-                <w:kern w:val="0"/>
-                <w:sz w:val="21"/>
-                <w:szCs w:val="21"/>
-              </w:rPr>
-              <w:t>E1</w:t>
-            </w:r>
-          </w:p>
-        </w:tc>
-        <w:tc>
-          <w:tcPr>
-            <w:tcW w:w="1702" w:type="dxa"/>
-          </w:tcPr>
-          <w:p>
-            <w:pPr>
-              <w:jc w:val="center"/>
-              <w:rPr>
-                <w:rFonts w:hint="eastAsia"/>
-                <w:i/>
-                <w:kern w:val="0"/>
-                <w:sz w:val="21"/>
-                <w:szCs w:val="21"/>
-              </w:rPr>
-            </w:pPr>
-            <w:r>
-              <w:rPr>
-                <w:rFonts w:hint="eastAsia"/>
-                <w:i/>
-                <w:kern w:val="0"/>
-                <w:sz w:val="21"/>
-                <w:szCs w:val="21"/>
-              </w:rPr>
-              <w:t>保留字节</w:t>
-            </w:r>
-          </w:p>
-        </w:tc>
-        <w:tc>
-          <w:tcPr>
-            <w:tcW w:w="850" w:type="dxa"/>
-            <w:vMerge w:val="continue"/>
-          </w:tcPr>
-          <w:p>
-            <w:pPr>
-              <w:jc w:val="center"/>
-              <w:rPr>
-                <w:rFonts w:hint="eastAsia"/>
-                <w:kern w:val="0"/>
-                <w:sz w:val="21"/>
-                <w:szCs w:val="21"/>
-              </w:rPr>
-            </w:pPr>
-          </w:p>
-        </w:tc>
-        <w:tc>
-          <w:tcPr>
-            <w:tcW w:w="4394" w:type="dxa"/>
-          </w:tcPr>
-          <w:p>
-            <w:pPr>
-              <w:rPr>
-                <w:rFonts w:hint="eastAsia"/>
-                <w:kern w:val="0"/>
-                <w:sz w:val="21"/>
-                <w:szCs w:val="21"/>
-              </w:rPr>
-            </w:pPr>
-            <w:r>
-              <w:rPr>
-                <w:rFonts w:hint="eastAsia"/>
-                <w:kern w:val="0"/>
-                <w:sz w:val="21"/>
-                <w:szCs w:val="21"/>
-              </w:rPr>
-              <w:t>多次堵转，停止变倍</w:t>
-            </w:r>
-          </w:p>
-        </w:tc>
-      </w:tr>
-      <w:tr>
-        <w:tblPrEx>
-          <w:tblBorders>
-            <w:top w:val="single" w:color="auto" w:sz="4" w:space="0"/>
-            <w:left w:val="single" w:color="auto" w:sz="4" w:space="0"/>
-            <w:bottom w:val="single" w:color="auto" w:sz="4" w:space="0"/>
-            <w:right w:val="single" w:color="auto" w:sz="4" w:space="0"/>
-            <w:insideH w:val="single" w:color="auto" w:sz="4" w:space="0"/>
-            <w:insideV w:val="single" w:color="auto" w:sz="4" w:space="0"/>
-          </w:tblBorders>
-        </w:tblPrEx>
-        <w:tc>
-          <w:tcPr>
-            <w:tcW w:w="993" w:type="dxa"/>
-            <w:vMerge w:val="continue"/>
-          </w:tcPr>
-          <w:p>
-            <w:pPr>
-              <w:rPr>
-                <w:rFonts w:hint="eastAsia"/>
-                <w:kern w:val="0"/>
-                <w:sz w:val="20"/>
-                <w:szCs w:val="21"/>
-              </w:rPr>
-            </w:pPr>
-          </w:p>
-        </w:tc>
-        <w:tc>
-          <w:tcPr>
-            <w:tcW w:w="708" w:type="dxa"/>
-          </w:tcPr>
-          <w:p>
-            <w:pPr>
-              <w:jc w:val="center"/>
-              <w:rPr>
-                <w:rFonts w:hint="eastAsia"/>
-                <w:kern w:val="0"/>
-                <w:sz w:val="21"/>
-                <w:szCs w:val="21"/>
-              </w:rPr>
-            </w:pPr>
-            <w:r>
-              <w:rPr>
-                <w:rFonts w:hint="eastAsia"/>
-                <w:kern w:val="0"/>
-                <w:sz w:val="21"/>
-                <w:szCs w:val="21"/>
-              </w:rPr>
-              <w:t>0x</w:t>
-            </w:r>
-            <w:r>
-              <w:rPr>
-                <w:kern w:val="0"/>
-                <w:sz w:val="21"/>
-                <w:szCs w:val="21"/>
-              </w:rPr>
-              <w:t>E2</w:t>
-            </w:r>
-          </w:p>
-        </w:tc>
-        <w:tc>
-          <w:tcPr>
-            <w:tcW w:w="1702" w:type="dxa"/>
-          </w:tcPr>
-          <w:p>
-            <w:pPr>
-              <w:jc w:val="center"/>
-              <w:rPr>
-                <w:rFonts w:hint="eastAsia"/>
-                <w:i/>
-                <w:kern w:val="0"/>
-                <w:sz w:val="21"/>
-                <w:szCs w:val="21"/>
-              </w:rPr>
-            </w:pPr>
-            <w:r>
-              <w:rPr>
-                <w:rFonts w:hint="eastAsia"/>
-                <w:i/>
-                <w:kern w:val="0"/>
-                <w:sz w:val="21"/>
-                <w:szCs w:val="21"/>
-              </w:rPr>
-              <w:t>保留字节</w:t>
-            </w:r>
-          </w:p>
-        </w:tc>
-        <w:tc>
-          <w:tcPr>
-            <w:tcW w:w="850" w:type="dxa"/>
-            <w:vMerge w:val="continue"/>
-          </w:tcPr>
-          <w:p>
-            <w:pPr>
-              <w:jc w:val="center"/>
-              <w:rPr>
-                <w:rFonts w:hint="eastAsia"/>
-                <w:kern w:val="0"/>
-                <w:sz w:val="21"/>
-                <w:szCs w:val="21"/>
-              </w:rPr>
-            </w:pPr>
-          </w:p>
-        </w:tc>
-        <w:tc>
-          <w:tcPr>
-            <w:tcW w:w="4394" w:type="dxa"/>
-          </w:tcPr>
-          <w:p>
-            <w:pPr>
-              <w:rPr>
-                <w:rFonts w:hint="eastAsia"/>
-                <w:kern w:val="0"/>
-                <w:sz w:val="21"/>
-                <w:szCs w:val="21"/>
-              </w:rPr>
-            </w:pPr>
-            <w:r>
-              <w:rPr>
-                <w:rFonts w:hint="eastAsia"/>
-                <w:kern w:val="0"/>
-                <w:sz w:val="21"/>
-                <w:szCs w:val="21"/>
-              </w:rPr>
-              <w:t>过流</w:t>
-            </w:r>
-          </w:p>
-        </w:tc>
-      </w:tr>
-      <w:tr>
-        <w:tblPrEx>
-          <w:tblBorders>
-            <w:top w:val="single" w:color="auto" w:sz="4" w:space="0"/>
-            <w:left w:val="single" w:color="auto" w:sz="4" w:space="0"/>
-            <w:bottom w:val="single" w:color="auto" w:sz="4" w:space="0"/>
-            <w:right w:val="single" w:color="auto" w:sz="4" w:space="0"/>
-            <w:insideH w:val="single" w:color="auto" w:sz="4" w:space="0"/>
-            <w:insideV w:val="single" w:color="auto" w:sz="4" w:space="0"/>
-          </w:tblBorders>
+          <w:tblCellMar>
+            <w:top w:w="0" w:type="dxa"/>
+            <w:left w:w="108" w:type="dxa"/>
+            <w:bottom w:w="0" w:type="dxa"/>
+            <w:right w:w="108" w:type="dxa"/>
+          </w:tblCellMar>
         </w:tblPrEx>
         <w:tc>
           <w:tcPr>
@@ -12812,6 +12920,8 @@
         </w:rPr>
         <w:t>，使用无刷直流电机驱动</w:t>
       </w:r>
+      <w:bookmarkStart w:id="0" w:name="_GoBack"/>
+      <w:bookmarkEnd w:id="0"/>
       <w:r>
         <w:rPr>
           <w:color w:val="ED7D31" w:themeColor="accent2"/>
@@ -12937,24 +13047,24 @@
             </w14:solidFill>
           </w14:textFill>
         </w:rPr>
-        <w:t>，使用无刷直流电机驱动</w:t>
-      </w:r>
-      <w:r>
-        <w:rPr>
+        <w:t>，使用</w:t>
+      </w:r>
+      <w:r>
+        <w:rPr>
+          <w:rFonts w:hint="eastAsia" w:eastAsia="宋体"/>
           <w:color w:val="ED7D31" w:themeColor="accent2"/>
           <w:kern w:val="0"/>
           <w:szCs w:val="21"/>
+          <w:lang w:eastAsia="zh-CN"/>
           <w14:textFill>
             <w14:solidFill>
               <w14:schemeClr w14:val="accent2"/>
             </w14:solidFill>
           </w14:textFill>
         </w:rPr>
-        <w:t>；</w:t>
-      </w:r>
-    </w:p>
-    <w:p>
-      <w:pPr>
+        <w:t>有</w:t>
+      </w:r>
+      <w:r>
         <w:rPr>
           <w:rFonts w:hint="eastAsia"/>
           <w:color w:val="ED7D31" w:themeColor="accent2"/>
@@ -12966,9 +13076,36 @@
             </w14:solidFill>
           </w14:textFill>
         </w:rPr>
-      </w:pPr>
-      <w:bookmarkStart w:id="0" w:name="_GoBack"/>
-      <w:bookmarkEnd w:id="0"/>
+        <w:t>刷直流电机驱动</w:t>
+      </w:r>
+      <w:r>
+        <w:rPr>
+          <w:color w:val="ED7D31" w:themeColor="accent2"/>
+          <w:kern w:val="0"/>
+          <w:szCs w:val="21"/>
+          <w14:textFill>
+            <w14:solidFill>
+              <w14:schemeClr w14:val="accent2"/>
+            </w14:solidFill>
+          </w14:textFill>
+        </w:rPr>
+        <w:t>；</w:t>
+      </w:r>
+    </w:p>
+    <w:p>
+      <w:pPr>
+        <w:rPr>
+          <w:rFonts w:hint="eastAsia"/>
+          <w:color w:val="ED7D31" w:themeColor="accent2"/>
+          <w:kern w:val="0"/>
+          <w:szCs w:val="21"/>
+          <w14:textFill>
+            <w14:solidFill>
+              <w14:schemeClr w14:val="accent2"/>
+            </w14:solidFill>
+          </w14:textFill>
+        </w:rPr>
+      </w:pPr>
     </w:p>
     <w:p>
       <w:pPr>
@@ -15725,7 +15862,7 @@
     <w:lsdException w:uiPriority="99" w:name="footnote text"/>
     <w:lsdException w:uiPriority="99" w:name="annotation text"/>
     <w:lsdException w:qFormat="1" w:uiPriority="99" w:semiHidden="0" w:name="header"/>
-    <w:lsdException w:uiPriority="99" w:semiHidden="0" w:name="footer"/>
+    <w:lsdException w:qFormat="1" w:uiPriority="99" w:semiHidden="0" w:name="footer"/>
     <w:lsdException w:uiPriority="99" w:name="index heading"/>
     <w:lsdException w:qFormat="1" w:uiPriority="35" w:name="caption"/>
     <w:lsdException w:uiPriority="99" w:name="table of figures"/>
@@ -15769,7 +15906,7 @@
     <w:lsdException w:uiPriority="99" w:name="Message Header"/>
     <w:lsdException w:qFormat="1" w:unhideWhenUsed="0" w:uiPriority="11" w:semiHidden="0" w:name="Subtitle"/>
     <w:lsdException w:uiPriority="99" w:name="Salutation"/>
-    <w:lsdException w:uiPriority="99" w:name="Date"/>
+    <w:lsdException w:qFormat="1" w:uiPriority="99" w:name="Date"/>
     <w:lsdException w:uiPriority="99" w:name="Body Text First Indent"/>
     <w:lsdException w:uiPriority="99" w:name="Body Text First Indent 2"/>
     <w:lsdException w:uiPriority="99" w:name="Note Heading"/>
@@ -15988,6 +16125,7 @@
     <w:link w:val="11"/>
     <w:semiHidden/>
     <w:unhideWhenUsed/>
+    <w:qFormat/>
     <w:uiPriority w:val="99"/>
     <w:pPr>
       <w:ind w:left="100" w:leftChars="2500"/>
@@ -15998,6 +16136,7 @@
     <w:basedOn w:val="1"/>
     <w:link w:val="9"/>
     <w:unhideWhenUsed/>
+    <w:qFormat/>
     <w:uiPriority w:val="99"/>
     <w:pPr>
       <w:tabs>
@@ -16071,6 +16210,7 @@
     <w:name w:val="页脚 字符"/>
     <w:basedOn w:val="7"/>
     <w:link w:val="3"/>
+    <w:qFormat/>
     <w:uiPriority w:val="99"/>
     <w:rPr>
       <w:sz w:val="18"/>
@@ -16091,6 +16231,7 @@
     <w:basedOn w:val="7"/>
     <w:link w:val="2"/>
     <w:semiHidden/>
+    <w:qFormat/>
     <w:uiPriority w:val="99"/>
   </w:style>
 </w:styles>
@@ -16352,7 +16493,7 @@
 </file>
 
 <file path=customXml/item1.xml><?xml version="1.0" encoding="utf-8"?>
-<b:Sources xmlns:b="http://schemas.openxmlformats.org/officeDocument/2006/bibliography" StyleName="APA" SelectedStyle="\APASixthEditionOfficeOnline.xsl" Version="6"/>
+<b:Sources xmlns:b="http://schemas.openxmlformats.org/officeDocument/2006/bibliography" Version="6" StyleName="APA" SelectedStyle="\APASixthEditionOfficeOnline.xsl"/>
 </file>
 
 <file path=customXml/itemProps1.xml><?xml version="1.0" encoding="utf-8"?>

</xml_diff>